<commit_message>
Document live Nebius quality findings and preserve targeted retry evidence
</commit_message>
<xml_diff>
--- a/docs/Lumen-Row-Project-Documentation.docx
+++ b/docs/Lumen-Row-Project-Documentation.docx
@@ -3813,6 +3813,75 @@
           </w:p>
         </w:tc>
       </w:tr>
+      <w:tr>
+        <w:trPr>
+          <w:cantSplit/>
+        </w:trPr>
+        <w:tc>
+          <w:tcPr>
+            <w:tcW w:type="dxa" w:w="4824"/>
+            <w:vAlign w:val="center"/>
+            <w:shd w:fill="FFFFFF"/>
+            <w:tcBorders>
+              <w:top w:val="single" w:sz="4" w:color="D9D9D9"/>
+              <w:left w:val="single" w:sz="4" w:color="D9D9D9"/>
+              <w:bottom w:val="single" w:sz="4" w:color="D9D9D9"/>
+              <w:right w:val="single" w:sz="4" w:color="D9D9D9"/>
+            </w:tcBorders>
+            <w:tcMar>
+              <w:top w:w="95" w:type="dxa"/>
+              <w:left w:w="95" w:type="dxa"/>
+              <w:bottom w:w="95" w:type="dxa"/>
+              <w:right w:w="95" w:type="dxa"/>
+            </w:tcMar>
+          </w:tcPr>
+          <w:p>
+            <w:pPr>
+              <w:spacing w:after="40" w:before="40" w:line="245" w:lineRule="auto"/>
+            </w:pPr>
+            <w:r>
+              <w:rPr>
+                <w:b w:val="0"/>
+                <w:color w:val="000000"/>
+                <w:sz w:val="20"/>
+              </w:rPr>
+              <w:t>A fresh Nebius evaluation ... measure missed issues, incorrect suggestions and unnecessary refusals ... keep results separate.</w:t>
+            </w:r>
+          </w:p>
+        </w:tc>
+        <w:tc>
+          <w:tcPr>
+            <w:tcW w:type="dxa" w:w="4968"/>
+            <w:vAlign w:val="center"/>
+            <w:shd w:fill="FFFFFF"/>
+            <w:tcBorders>
+              <w:top w:val="single" w:sz="4" w:color="D9D9D9"/>
+              <w:left w:val="single" w:sz="4" w:color="D9D9D9"/>
+              <w:bottom w:val="single" w:sz="4" w:color="D9D9D9"/>
+              <w:right w:val="single" w:sz="4" w:color="D9D9D9"/>
+            </w:tcBorders>
+            <w:tcMar>
+              <w:top w:w="95" w:type="dxa"/>
+              <w:left w:w="95" w:type="dxa"/>
+              <w:bottom w:w="95" w:type="dxa"/>
+              <w:right w:w="95" w:type="dxa"/>
+            </w:tcMar>
+          </w:tcPr>
+          <w:p>
+            <w:pPr>
+              <w:spacing w:after="40" w:before="40" w:line="245" w:lineRule="auto"/>
+            </w:pPr>
+            <w:r>
+              <w:rPr>
+                <w:b w:val="0"/>
+                <w:color w:val="000000"/>
+                <w:sz w:val="20"/>
+              </w:rPr>
+              <w:t>Fourteen pre-labeled cases, raw versus guarded scoring, separate cohorts and an auditable live-results package.</w:t>
+            </w:r>
+          </w:p>
+        </w:tc>
+      </w:tr>
     </w:tbl>
     <w:p>
       <w:pPr>
@@ -4322,7 +4391,1887 @@
     </w:p>
     <w:p>
       <w:r>
-        <w:t>Next improvements include broader evaluation with independently labeled datasets, measured live-model reliability and cost, richer export formats, and access controls before any multi-user deployment.</w:t>
+        <w:t>The fresh Nebius study that follows adds live exception, multi-item and abstention checks. Further work includes independently reviewed datasets, repeated runs, richer validation and export rules, and access controls before multi-user deployment.</w:t>
+      </w:r>
+    </w:p>
+    <w:p>
+      <w:r>
+        <w:br w:type="page"/>
+      </w:r>
+    </w:p>
+    <w:p>
+      <w:pPr>
+        <w:pStyle w:val="Heading1"/>
+      </w:pPr>
+      <w:r>
+        <w:t>Fresh Nebius evaluation method</w:t>
+      </w:r>
+    </w:p>
+    <w:p>
+      <w:r>
+        <w:t>A new 14-case study used Nebius model Qwen/Qwen3.5-397B-A17B at temperature 0. The records, expected issue locations and correction answers were fixed before the calls. This is a single-pass study of fictional fixtures, separate from the earlier ten offline cases and regression suite.</w:t>
+      </w:r>
+    </w:p>
+    <w:p>
+      <w:r>
+        <w:t>The study applies the previous project feedback to exception handling, coverage across multiple items, and unnecessary refusals. Four cohorts remain separate: declared rules, semantic corrections, exception and missing-knowledge cases, and full-source coverage probes. Research-paper and CMS results are not pooled into these numbers.</w:t>
+      </w:r>
+    </w:p>
+    <w:tbl>
+      <w:tblPr>
+        <w:tblW w:type="auto" w:w="0"/>
+        <w:tblLayout w:type="fixed"/>
+        <w:tblLook w:firstColumn="1" w:firstRow="1" w:lastColumn="0" w:lastRow="0" w:noHBand="0" w:noVBand="1" w:val="04A0"/>
+      </w:tblPr>
+      <w:tblGrid>
+        <w:gridCol w:w="2376"/>
+        <w:gridCol w:w="7416"/>
+      </w:tblGrid>
+      <w:tr>
+        <w:trPr>
+          <w:cantSplit/>
+          <w:tblHeader/>
+        </w:trPr>
+        <w:tc>
+          <w:tcPr>
+            <w:tcW w:type="dxa" w:w="2376"/>
+            <w:vAlign w:val="center"/>
+            <w:shd w:fill="263A52"/>
+            <w:tcBorders>
+              <w:top w:val="single" w:sz="4" w:color="D9D9D9"/>
+              <w:left w:val="single" w:sz="4" w:color="D9D9D9"/>
+              <w:bottom w:val="single" w:sz="4" w:color="D9D9D9"/>
+              <w:right w:val="single" w:sz="4" w:color="D9D9D9"/>
+            </w:tcBorders>
+            <w:tcMar>
+              <w:top w:w="95" w:type="dxa"/>
+              <w:left w:w="95" w:type="dxa"/>
+              <w:bottom w:w="95" w:type="dxa"/>
+              <w:right w:w="95" w:type="dxa"/>
+            </w:tcMar>
+          </w:tcPr>
+          <w:p>
+            <w:pPr>
+              <w:spacing w:after="40" w:before="40" w:line="245" w:lineRule="auto"/>
+            </w:pPr>
+            <w:r>
+              <w:rPr>
+                <w:b/>
+                <w:color w:val="FFFFFF"/>
+                <w:sz w:val="20"/>
+              </w:rPr>
+              <w:t>Measure</w:t>
+            </w:r>
+          </w:p>
+        </w:tc>
+        <w:tc>
+          <w:tcPr>
+            <w:tcW w:type="dxa" w:w="7416"/>
+            <w:vAlign w:val="center"/>
+            <w:shd w:fill="263A52"/>
+            <w:tcBorders>
+              <w:top w:val="single" w:sz="4" w:color="D9D9D9"/>
+              <w:left w:val="single" w:sz="4" w:color="D9D9D9"/>
+              <w:bottom w:val="single" w:sz="4" w:color="D9D9D9"/>
+              <w:right w:val="single" w:sz="4" w:color="D9D9D9"/>
+            </w:tcBorders>
+            <w:tcMar>
+              <w:top w:w="95" w:type="dxa"/>
+              <w:left w:w="95" w:type="dxa"/>
+              <w:bottom w:w="95" w:type="dxa"/>
+              <w:right w:w="95" w:type="dxa"/>
+            </w:tcMar>
+          </w:tcPr>
+          <w:p>
+            <w:pPr>
+              <w:spacing w:after="40" w:before="40" w:line="245" w:lineRule="auto"/>
+            </w:pPr>
+            <w:r>
+              <w:rPr>
+                <w:b/>
+                <w:color w:val="FFFFFF"/>
+                <w:sz w:val="20"/>
+              </w:rPr>
+              <w:t>Definition</w:t>
+            </w:r>
+          </w:p>
+        </w:tc>
+      </w:tr>
+      <w:tr>
+        <w:trPr>
+          <w:cantSplit/>
+        </w:trPr>
+        <w:tc>
+          <w:tcPr>
+            <w:tcW w:type="dxa" w:w="2376"/>
+            <w:vAlign w:val="center"/>
+            <w:shd w:fill="FFFFFF"/>
+            <w:tcBorders>
+              <w:top w:val="single" w:sz="4" w:color="D9D9D9"/>
+              <w:left w:val="single" w:sz="4" w:color="D9D9D9"/>
+              <w:bottom w:val="single" w:sz="4" w:color="D9D9D9"/>
+              <w:right w:val="single" w:sz="4" w:color="D9D9D9"/>
+            </w:tcBorders>
+            <w:tcMar>
+              <w:top w:w="95" w:type="dxa"/>
+              <w:left w:w="95" w:type="dxa"/>
+              <w:bottom w:w="95" w:type="dxa"/>
+              <w:right w:w="95" w:type="dxa"/>
+            </w:tcMar>
+          </w:tcPr>
+          <w:p>
+            <w:pPr>
+              <w:spacing w:after="40" w:before="40" w:line="245" w:lineRule="auto"/>
+            </w:pPr>
+            <w:r>
+              <w:rPr>
+                <w:b w:val="0"/>
+                <w:color w:val="000000"/>
+                <w:sz w:val="20"/>
+              </w:rPr>
+              <w:t>Missed issues</w:t>
+            </w:r>
+          </w:p>
+        </w:tc>
+        <w:tc>
+          <w:tcPr>
+            <w:tcW w:type="dxa" w:w="7416"/>
+            <w:vAlign w:val="center"/>
+            <w:shd w:fill="FFFFFF"/>
+            <w:tcBorders>
+              <w:top w:val="single" w:sz="4" w:color="D9D9D9"/>
+              <w:left w:val="single" w:sz="4" w:color="D9D9D9"/>
+              <w:bottom w:val="single" w:sz="4" w:color="D9D9D9"/>
+              <w:right w:val="single" w:sz="4" w:color="D9D9D9"/>
+            </w:tcBorders>
+            <w:tcMar>
+              <w:top w:w="95" w:type="dxa"/>
+              <w:left w:w="95" w:type="dxa"/>
+              <w:bottom w:w="95" w:type="dxa"/>
+              <w:right w:w="95" w:type="dxa"/>
+            </w:tcMar>
+          </w:tcPr>
+          <w:p>
+            <w:pPr>
+              <w:spacing w:after="40" w:before="40" w:line="245" w:lineRule="auto"/>
+            </w:pPr>
+            <w:r>
+              <w:rPr>
+                <w:b w:val="0"/>
+                <w:color w:val="000000"/>
+                <w:sz w:val="20"/>
+              </w:rPr>
+              <w:t>Compare every expected record, field and issue type with local validation. Python detects issues; these recall figures are not attributed to the language model.</w:t>
+            </w:r>
+          </w:p>
+        </w:tc>
+      </w:tr>
+      <w:tr>
+        <w:trPr>
+          <w:cantSplit/>
+        </w:trPr>
+        <w:tc>
+          <w:tcPr>
+            <w:tcW w:type="dxa" w:w="2376"/>
+            <w:vAlign w:val="center"/>
+            <w:shd w:fill="F2F5F8"/>
+            <w:tcBorders>
+              <w:top w:val="single" w:sz="4" w:color="D9D9D9"/>
+              <w:left w:val="single" w:sz="4" w:color="D9D9D9"/>
+              <w:bottom w:val="single" w:sz="4" w:color="D9D9D9"/>
+              <w:right w:val="single" w:sz="4" w:color="D9D9D9"/>
+            </w:tcBorders>
+            <w:tcMar>
+              <w:top w:w="95" w:type="dxa"/>
+              <w:left w:w="95" w:type="dxa"/>
+              <w:bottom w:w="95" w:type="dxa"/>
+              <w:right w:w="95" w:type="dxa"/>
+            </w:tcMar>
+          </w:tcPr>
+          <w:p>
+            <w:pPr>
+              <w:spacing w:after="40" w:before="40" w:line="245" w:lineRule="auto"/>
+            </w:pPr>
+            <w:r>
+              <w:rPr>
+                <w:b w:val="0"/>
+                <w:color w:val="000000"/>
+                <w:sz w:val="20"/>
+              </w:rPr>
+              <w:t>Incorrect suggestions</w:t>
+            </w:r>
+          </w:p>
+        </w:tc>
+        <w:tc>
+          <w:tcPr>
+            <w:tcW w:type="dxa" w:w="7416"/>
+            <w:vAlign w:val="center"/>
+            <w:shd w:fill="F2F5F8"/>
+            <w:tcBorders>
+              <w:top w:val="single" w:sz="4" w:color="D9D9D9"/>
+              <w:left w:val="single" w:sz="4" w:color="D9D9D9"/>
+              <w:bottom w:val="single" w:sz="4" w:color="D9D9D9"/>
+              <w:right w:val="single" w:sz="4" w:color="D9D9D9"/>
+            </w:tcBorders>
+            <w:tcMar>
+              <w:top w:w="95" w:type="dxa"/>
+              <w:left w:w="95" w:type="dxa"/>
+              <w:bottom w:w="95" w:type="dxa"/>
+              <w:right w:w="95" w:type="dxa"/>
+            </w:tcMar>
+          </w:tcPr>
+          <w:p>
+            <w:pPr>
+              <w:spacing w:after="40" w:before="40" w:line="245" w:lineRule="auto"/>
+            </w:pPr>
+            <w:r>
+              <w:rPr>
+                <w:b w:val="0"/>
+                <w:color w:val="000000"/>
+                <w:sz w:val="20"/>
+              </w:rPr>
+              <w:t>Compare raw and user-visible values with the fixture answers. Count unsupported guesses even if they accidentally match. Include factually wrong date hypotheses in the factual total, with that subtype reported separately.</w:t>
+            </w:r>
+          </w:p>
+        </w:tc>
+      </w:tr>
+      <w:tr>
+        <w:trPr>
+          <w:cantSplit/>
+        </w:trPr>
+        <w:tc>
+          <w:tcPr>
+            <w:tcW w:type="dxa" w:w="2376"/>
+            <w:vAlign w:val="center"/>
+            <w:shd w:fill="FFFFFF"/>
+            <w:tcBorders>
+              <w:top w:val="single" w:sz="4" w:color="D9D9D9"/>
+              <w:left w:val="single" w:sz="4" w:color="D9D9D9"/>
+              <w:bottom w:val="single" w:sz="4" w:color="D9D9D9"/>
+              <w:right w:val="single" w:sz="4" w:color="D9D9D9"/>
+            </w:tcBorders>
+            <w:tcMar>
+              <w:top w:w="95" w:type="dxa"/>
+              <w:left w:w="95" w:type="dxa"/>
+              <w:bottom w:w="95" w:type="dxa"/>
+              <w:right w:w="95" w:type="dxa"/>
+            </w:tcMar>
+          </w:tcPr>
+          <w:p>
+            <w:pPr>
+              <w:spacing w:after="40" w:before="40" w:line="245" w:lineRule="auto"/>
+            </w:pPr>
+            <w:r>
+              <w:rPr>
+                <w:b w:val="0"/>
+                <w:color w:val="000000"/>
+                <w:sz w:val="20"/>
+              </w:rPr>
+              <w:t>Unnecessary refusals</w:t>
+            </w:r>
+          </w:p>
+        </w:tc>
+        <w:tc>
+          <w:tcPr>
+            <w:tcW w:type="dxa" w:w="7416"/>
+            <w:vAlign w:val="center"/>
+            <w:shd w:fill="FFFFFF"/>
+            <w:tcBorders>
+              <w:top w:val="single" w:sz="4" w:color="D9D9D9"/>
+              <w:left w:val="single" w:sz="4" w:color="D9D9D9"/>
+              <w:bottom w:val="single" w:sz="4" w:color="D9D9D9"/>
+              <w:right w:val="single" w:sz="4" w:color="D9D9D9"/>
+            </w:tcBorders>
+            <w:tcMar>
+              <w:top w:w="95" w:type="dxa"/>
+              <w:left w:w="95" w:type="dxa"/>
+              <w:bottom w:w="95" w:type="dxa"/>
+              <w:right w:w="95" w:type="dxa"/>
+            </w:tcMar>
+          </w:tcPr>
+          <w:p>
+            <w:pPr>
+              <w:spacing w:after="40" w:before="40" w:line="245" w:lineRule="auto"/>
+            </w:pPr>
+            <w:r>
+              <w:rPr>
+                <w:b w:val="0"/>
+                <w:color w:val="000000"/>
+                <w:sz w:val="20"/>
+              </w:rPr>
+              <w:t>Explicit abstentions where the disclosed evidence supports a known answer, divided by answerable requested cells. Missing responses and provider failures are reported separately.</w:t>
+            </w:r>
+          </w:p>
+        </w:tc>
+      </w:tr>
+      <w:tr>
+        <w:trPr>
+          <w:cantSplit/>
+        </w:trPr>
+        <w:tc>
+          <w:tcPr>
+            <w:tcW w:type="dxa" w:w="2376"/>
+            <w:vAlign w:val="center"/>
+            <w:shd w:fill="F2F5F8"/>
+            <w:tcBorders>
+              <w:top w:val="single" w:sz="4" w:color="D9D9D9"/>
+              <w:left w:val="single" w:sz="4" w:color="D9D9D9"/>
+              <w:bottom w:val="single" w:sz="4" w:color="D9D9D9"/>
+              <w:right w:val="single" w:sz="4" w:color="D9D9D9"/>
+            </w:tcBorders>
+            <w:tcMar>
+              <w:top w:w="95" w:type="dxa"/>
+              <w:left w:w="95" w:type="dxa"/>
+              <w:bottom w:w="95" w:type="dxa"/>
+              <w:right w:w="95" w:type="dxa"/>
+            </w:tcMar>
+          </w:tcPr>
+          <w:p>
+            <w:pPr>
+              <w:spacing w:after="40" w:before="40" w:line="245" w:lineRule="auto"/>
+            </w:pPr>
+            <w:r>
+              <w:rPr>
+                <w:b w:val="0"/>
+                <w:color w:val="000000"/>
+                <w:sz w:val="20"/>
+              </w:rPr>
+              <w:t>Coverage across items</w:t>
+            </w:r>
+          </w:p>
+        </w:tc>
+        <w:tc>
+          <w:tcPr>
+            <w:tcW w:type="dxa" w:w="7416"/>
+            <w:vAlign w:val="center"/>
+            <w:shd w:fill="F2F5F8"/>
+            <w:tcBorders>
+              <w:top w:val="single" w:sz="4" w:color="D9D9D9"/>
+              <w:left w:val="single" w:sz="4" w:color="D9D9D9"/>
+              <w:bottom w:val="single" w:sz="4" w:color="D9D9D9"/>
+              <w:right w:val="single" w:sz="4" w:color="D9D9D9"/>
+            </w:tcBorders>
+            <w:tcMar>
+              <w:top w:w="95" w:type="dxa"/>
+              <w:left w:w="95" w:type="dxa"/>
+              <w:bottom w:w="95" w:type="dxa"/>
+              <w:right w:w="95" w:type="dxa"/>
+            </w:tcMar>
+          </w:tcPr>
+          <w:p>
+            <w:pPr>
+              <w:spacing w:after="40" w:before="40" w:line="245" w:lineRule="auto"/>
+            </w:pPr>
+            <w:r>
+              <w:rPr>
+                <w:b w:val="0"/>
+                <w:color w:val="000000"/>
+                <w:sz w:val="20"/>
+              </w:rPr>
+              <w:t>Check response items for every affected cell, including batches with multiple records. Keep raw output separate from what safeguards allow through.</w:t>
+            </w:r>
+          </w:p>
+        </w:tc>
+      </w:tr>
+      <w:tr>
+        <w:trPr>
+          <w:cantSplit/>
+        </w:trPr>
+        <w:tc>
+          <w:tcPr>
+            <w:tcW w:type="dxa" w:w="2376"/>
+            <w:vAlign w:val="center"/>
+            <w:shd w:fill="FFFFFF"/>
+            <w:tcBorders>
+              <w:top w:val="single" w:sz="4" w:color="D9D9D9"/>
+              <w:left w:val="single" w:sz="4" w:color="D9D9D9"/>
+              <w:bottom w:val="single" w:sz="4" w:color="D9D9D9"/>
+              <w:right w:val="single" w:sz="4" w:color="D9D9D9"/>
+            </w:tcBorders>
+            <w:tcMar>
+              <w:top w:w="95" w:type="dxa"/>
+              <w:left w:w="95" w:type="dxa"/>
+              <w:bottom w:w="95" w:type="dxa"/>
+              <w:right w:w="95" w:type="dxa"/>
+            </w:tcMar>
+          </w:tcPr>
+          <w:p>
+            <w:pPr>
+              <w:spacing w:after="40" w:before="40" w:line="245" w:lineRule="auto"/>
+            </w:pPr>
+            <w:r>
+              <w:rPr>
+                <w:b w:val="0"/>
+                <w:color w:val="000000"/>
+                <w:sz w:val="20"/>
+              </w:rPr>
+              <w:t>Complete reviewed outcome</w:t>
+            </w:r>
+          </w:p>
+        </w:tc>
+        <w:tc>
+          <w:tcPr>
+            <w:tcW w:type="dxa" w:w="7416"/>
+            <w:vAlign w:val="center"/>
+            <w:shd w:fill="FFFFFF"/>
+            <w:tcBorders>
+              <w:top w:val="single" w:sz="4" w:color="D9D9D9"/>
+              <w:left w:val="single" w:sz="4" w:color="D9D9D9"/>
+              <w:bottom w:val="single" w:sz="4" w:color="D9D9D9"/>
+              <w:right w:val="single" w:sz="4" w:color="D9D9D9"/>
+            </w:tcBorders>
+            <w:tcMar>
+              <w:top w:w="95" w:type="dxa"/>
+              <w:left w:w="95" w:type="dxa"/>
+              <w:bottom w:w="95" w:type="dxa"/>
+              <w:right w:w="95" w:type="dxa"/>
+            </w:tcMar>
+          </w:tcPr>
+          <w:p>
+            <w:pPr>
+              <w:spacing w:after="40" w:before="40" w:line="245" w:lineRule="auto"/>
+            </w:pPr>
+            <w:r>
+              <w:rPr>
+                <w:b w:val="0"/>
+                <w:color w:val="000000"/>
+                <w:sz w:val="20"/>
+              </w:rPr>
+              <w:t>For repairable fixtures, require exact expected output, preserved originals and both scripted approvals. For hold cases, an approval-ready state is a failure even if the evaluator withholds approval.</w:t>
+            </w:r>
+          </w:p>
+        </w:tc>
+      </w:tr>
+    </w:tbl>
+    <w:p>
+      <w:pPr>
+        <w:spacing w:after="20"/>
+      </w:pPr>
+    </w:p>
+    <w:p>
+      <w:r>
+        <w:t>The model receives the normal production context: aggregate references for investigation and consented affected values/rules for value assistance. Gold answers and source notes are withheld. Two source-coverage cases intentionally contain requirements that cannot be represented by the current rule schema, testing the system boundary rather than expecting the model to know an undisclosed policy.</w:t>
+      </w:r>
+    </w:p>
+    <w:p>
+      <w:r>
+        <w:t>The evaluation runner saves each exact fictional request preview before sending it. It records model replies, tool calls, tokens, corpus and runner hashes, and the application commit. It never uses saved customer jobs or publishes API credentials. No production prompt or guardrail was tuned to improve this run.</w:t>
+      </w:r>
+    </w:p>
+    <w:p>
+      <w:r>
+        <w:t>Reproduce a local preflight with: python scripts/evaluate_nebius.py. Live calls require: python scripts/evaluate_nebius.py --live --consent-synthetic. The command uses your configured provider key, incurs normal provider usage, and writes job artifacts only to ignored tmp storage.</w:t>
+      </w:r>
+    </w:p>
+    <w:p>
+      <w:r>
+        <w:br w:type="page"/>
+      </w:r>
+    </w:p>
+    <w:p>
+      <w:pPr>
+        <w:pStyle w:val="Heading1"/>
+      </w:pPr>
+      <w:r>
+        <w:t>Fresh Nebius results by cohort</w:t>
+      </w:r>
+    </w:p>
+    <w:tbl>
+      <w:tblPr>
+        <w:tblW w:type="auto" w:w="0"/>
+        <w:tblLayout w:type="fixed"/>
+        <w:tblLook w:firstColumn="1" w:firstRow="1" w:lastColumn="0" w:lastRow="0" w:noHBand="0" w:noVBand="1" w:val="04A0"/>
+      </w:tblPr>
+      <w:tblGrid>
+        <w:gridCol w:w="3600"/>
+        <w:gridCol w:w="936"/>
+        <w:gridCol w:w="2808"/>
+        <w:gridCol w:w="2448"/>
+      </w:tblGrid>
+      <w:tr>
+        <w:trPr>
+          <w:cantSplit/>
+          <w:tblHeader/>
+        </w:trPr>
+        <w:tc>
+          <w:tcPr>
+            <w:tcW w:type="dxa" w:w="3600"/>
+            <w:vAlign w:val="center"/>
+            <w:shd w:fill="263A52"/>
+            <w:tcBorders>
+              <w:top w:val="single" w:sz="4" w:color="D9D9D9"/>
+              <w:left w:val="single" w:sz="4" w:color="D9D9D9"/>
+              <w:bottom w:val="single" w:sz="4" w:color="D9D9D9"/>
+              <w:right w:val="single" w:sz="4" w:color="D9D9D9"/>
+            </w:tcBorders>
+            <w:tcMar>
+              <w:top w:w="95" w:type="dxa"/>
+              <w:left w:w="95" w:type="dxa"/>
+              <w:bottom w:w="95" w:type="dxa"/>
+              <w:right w:w="95" w:type="dxa"/>
+            </w:tcMar>
+          </w:tcPr>
+          <w:p>
+            <w:pPr>
+              <w:spacing w:after="40" w:before="40" w:line="245" w:lineRule="auto"/>
+            </w:pPr>
+            <w:r>
+              <w:rPr>
+                <w:b/>
+                <w:color w:val="FFFFFF"/>
+                <w:sz w:val="20"/>
+              </w:rPr>
+              <w:t>Cohort</w:t>
+            </w:r>
+          </w:p>
+        </w:tc>
+        <w:tc>
+          <w:tcPr>
+            <w:tcW w:type="dxa" w:w="936"/>
+            <w:vAlign w:val="center"/>
+            <w:shd w:fill="263A52"/>
+            <w:tcBorders>
+              <w:top w:val="single" w:sz="4" w:color="D9D9D9"/>
+              <w:left w:val="single" w:sz="4" w:color="D9D9D9"/>
+              <w:bottom w:val="single" w:sz="4" w:color="D9D9D9"/>
+              <w:right w:val="single" w:sz="4" w:color="D9D9D9"/>
+            </w:tcBorders>
+            <w:tcMar>
+              <w:top w:w="95" w:type="dxa"/>
+              <w:left w:w="95" w:type="dxa"/>
+              <w:bottom w:w="95" w:type="dxa"/>
+              <w:right w:w="95" w:type="dxa"/>
+            </w:tcMar>
+          </w:tcPr>
+          <w:p>
+            <w:pPr>
+              <w:spacing w:after="40" w:before="40" w:line="245" w:lineRule="auto"/>
+            </w:pPr>
+            <w:r>
+              <w:rPr>
+                <w:b/>
+                <w:color w:val="FFFFFF"/>
+                <w:sz w:val="20"/>
+              </w:rPr>
+              <w:t>Cases</w:t>
+            </w:r>
+          </w:p>
+        </w:tc>
+        <w:tc>
+          <w:tcPr>
+            <w:tcW w:type="dxa" w:w="2808"/>
+            <w:vAlign w:val="center"/>
+            <w:shd w:fill="263A52"/>
+            <w:tcBorders>
+              <w:top w:val="single" w:sz="4" w:color="D9D9D9"/>
+              <w:left w:val="single" w:sz="4" w:color="D9D9D9"/>
+              <w:bottom w:val="single" w:sz="4" w:color="D9D9D9"/>
+              <w:right w:val="single" w:sz="4" w:color="D9D9D9"/>
+            </w:tcBorders>
+            <w:tcMar>
+              <w:top w:w="95" w:type="dxa"/>
+              <w:left w:w="95" w:type="dxa"/>
+              <w:bottom w:w="95" w:type="dxa"/>
+              <w:right w:w="95" w:type="dxa"/>
+            </w:tcMar>
+          </w:tcPr>
+          <w:p>
+            <w:pPr>
+              <w:spacing w:after="40" w:before="40" w:line="245" w:lineRule="auto"/>
+            </w:pPr>
+            <w:r>
+              <w:rPr>
+                <w:b/>
+                <w:color w:val="FFFFFF"/>
+                <w:sz w:val="20"/>
+              </w:rPr>
+              <w:t>Missed / expected</w:t>
+            </w:r>
+          </w:p>
+        </w:tc>
+        <w:tc>
+          <w:tcPr>
+            <w:tcW w:type="dxa" w:w="2448"/>
+            <w:vAlign w:val="center"/>
+            <w:shd w:fill="263A52"/>
+            <w:tcBorders>
+              <w:top w:val="single" w:sz="4" w:color="D9D9D9"/>
+              <w:left w:val="single" w:sz="4" w:color="D9D9D9"/>
+              <w:bottom w:val="single" w:sz="4" w:color="D9D9D9"/>
+              <w:right w:val="single" w:sz="4" w:color="D9D9D9"/>
+            </w:tcBorders>
+            <w:tcMar>
+              <w:top w:w="95" w:type="dxa"/>
+              <w:left w:w="95" w:type="dxa"/>
+              <w:bottom w:w="95" w:type="dxa"/>
+              <w:right w:w="95" w:type="dxa"/>
+            </w:tcMar>
+          </w:tcPr>
+          <w:p>
+            <w:pPr>
+              <w:spacing w:after="40" w:before="40" w:line="245" w:lineRule="auto"/>
+            </w:pPr>
+            <w:r>
+              <w:rPr>
+                <w:b/>
+                <w:color w:val="FFFFFF"/>
+                <w:sz w:val="20"/>
+              </w:rPr>
+              <w:t>False alarms</w:t>
+            </w:r>
+          </w:p>
+        </w:tc>
+      </w:tr>
+      <w:tr>
+        <w:trPr>
+          <w:cantSplit/>
+        </w:trPr>
+        <w:tc>
+          <w:tcPr>
+            <w:tcW w:type="dxa" w:w="3600"/>
+            <w:vAlign w:val="center"/>
+            <w:shd w:fill="FFFFFF"/>
+            <w:tcBorders>
+              <w:top w:val="single" w:sz="4" w:color="D9D9D9"/>
+              <w:left w:val="single" w:sz="4" w:color="D9D9D9"/>
+              <w:bottom w:val="single" w:sz="4" w:color="D9D9D9"/>
+              <w:right w:val="single" w:sz="4" w:color="D9D9D9"/>
+            </w:tcBorders>
+            <w:tcMar>
+              <w:top w:w="95" w:type="dxa"/>
+              <w:left w:w="95" w:type="dxa"/>
+              <w:bottom w:w="95" w:type="dxa"/>
+              <w:right w:w="95" w:type="dxa"/>
+            </w:tcMar>
+          </w:tcPr>
+          <w:p>
+            <w:pPr>
+              <w:spacing w:after="40" w:before="40" w:line="245" w:lineRule="auto"/>
+            </w:pPr>
+            <w:r>
+              <w:rPr>
+                <w:b w:val="0"/>
+                <w:color w:val="000000"/>
+                <w:sz w:val="20"/>
+              </w:rPr>
+              <w:t>Declared rules</w:t>
+            </w:r>
+          </w:p>
+        </w:tc>
+        <w:tc>
+          <w:tcPr>
+            <w:tcW w:type="dxa" w:w="936"/>
+            <w:vAlign w:val="center"/>
+            <w:shd w:fill="FFFFFF"/>
+            <w:tcBorders>
+              <w:top w:val="single" w:sz="4" w:color="D9D9D9"/>
+              <w:left w:val="single" w:sz="4" w:color="D9D9D9"/>
+              <w:bottom w:val="single" w:sz="4" w:color="D9D9D9"/>
+              <w:right w:val="single" w:sz="4" w:color="D9D9D9"/>
+            </w:tcBorders>
+            <w:tcMar>
+              <w:top w:w="95" w:type="dxa"/>
+              <w:left w:w="95" w:type="dxa"/>
+              <w:bottom w:w="95" w:type="dxa"/>
+              <w:right w:w="95" w:type="dxa"/>
+            </w:tcMar>
+          </w:tcPr>
+          <w:p>
+            <w:pPr>
+              <w:spacing w:after="40" w:before="40" w:line="245" w:lineRule="auto"/>
+            </w:pPr>
+            <w:r>
+              <w:rPr>
+                <w:b w:val="0"/>
+                <w:color w:val="000000"/>
+                <w:sz w:val="20"/>
+              </w:rPr>
+              <w:t>4</w:t>
+            </w:r>
+          </w:p>
+        </w:tc>
+        <w:tc>
+          <w:tcPr>
+            <w:tcW w:type="dxa" w:w="2808"/>
+            <w:vAlign w:val="center"/>
+            <w:shd w:fill="FFFFFF"/>
+            <w:tcBorders>
+              <w:top w:val="single" w:sz="4" w:color="D9D9D9"/>
+              <w:left w:val="single" w:sz="4" w:color="D9D9D9"/>
+              <w:bottom w:val="single" w:sz="4" w:color="D9D9D9"/>
+              <w:right w:val="single" w:sz="4" w:color="D9D9D9"/>
+            </w:tcBorders>
+            <w:tcMar>
+              <w:top w:w="95" w:type="dxa"/>
+              <w:left w:w="95" w:type="dxa"/>
+              <w:bottom w:w="95" w:type="dxa"/>
+              <w:right w:w="95" w:type="dxa"/>
+            </w:tcMar>
+          </w:tcPr>
+          <w:p>
+            <w:pPr>
+              <w:spacing w:after="40" w:before="40" w:line="245" w:lineRule="auto"/>
+            </w:pPr>
+            <w:r>
+              <w:rPr>
+                <w:b w:val="0"/>
+                <w:color w:val="000000"/>
+                <w:sz w:val="20"/>
+              </w:rPr>
+              <w:t>0 / 7</w:t>
+            </w:r>
+          </w:p>
+        </w:tc>
+        <w:tc>
+          <w:tcPr>
+            <w:tcW w:type="dxa" w:w="2448"/>
+            <w:vAlign w:val="center"/>
+            <w:shd w:fill="FFFFFF"/>
+            <w:tcBorders>
+              <w:top w:val="single" w:sz="4" w:color="D9D9D9"/>
+              <w:left w:val="single" w:sz="4" w:color="D9D9D9"/>
+              <w:bottom w:val="single" w:sz="4" w:color="D9D9D9"/>
+              <w:right w:val="single" w:sz="4" w:color="D9D9D9"/>
+            </w:tcBorders>
+            <w:tcMar>
+              <w:top w:w="95" w:type="dxa"/>
+              <w:left w:w="95" w:type="dxa"/>
+              <w:bottom w:w="95" w:type="dxa"/>
+              <w:right w:w="95" w:type="dxa"/>
+            </w:tcMar>
+          </w:tcPr>
+          <w:p>
+            <w:pPr>
+              <w:spacing w:after="40" w:before="40" w:line="245" w:lineRule="auto"/>
+            </w:pPr>
+            <w:r>
+              <w:rPr>
+                <w:b w:val="0"/>
+                <w:color w:val="000000"/>
+                <w:sz w:val="20"/>
+              </w:rPr>
+              <w:t>0</w:t>
+            </w:r>
+          </w:p>
+        </w:tc>
+      </w:tr>
+      <w:tr>
+        <w:trPr>
+          <w:cantSplit/>
+        </w:trPr>
+        <w:tc>
+          <w:tcPr>
+            <w:tcW w:type="dxa" w:w="3600"/>
+            <w:vAlign w:val="center"/>
+            <w:shd w:fill="F2F5F8"/>
+            <w:tcBorders>
+              <w:top w:val="single" w:sz="4" w:color="D9D9D9"/>
+              <w:left w:val="single" w:sz="4" w:color="D9D9D9"/>
+              <w:bottom w:val="single" w:sz="4" w:color="D9D9D9"/>
+              <w:right w:val="single" w:sz="4" w:color="D9D9D9"/>
+            </w:tcBorders>
+            <w:tcMar>
+              <w:top w:w="95" w:type="dxa"/>
+              <w:left w:w="95" w:type="dxa"/>
+              <w:bottom w:w="95" w:type="dxa"/>
+              <w:right w:w="95" w:type="dxa"/>
+            </w:tcMar>
+          </w:tcPr>
+          <w:p>
+            <w:pPr>
+              <w:spacing w:after="40" w:before="40" w:line="245" w:lineRule="auto"/>
+            </w:pPr>
+            <w:r>
+              <w:rPr>
+                <w:b w:val="0"/>
+                <w:color w:val="000000"/>
+                <w:sz w:val="20"/>
+              </w:rPr>
+              <w:t>Semantic repairs</w:t>
+            </w:r>
+          </w:p>
+        </w:tc>
+        <w:tc>
+          <w:tcPr>
+            <w:tcW w:type="dxa" w:w="936"/>
+            <w:vAlign w:val="center"/>
+            <w:shd w:fill="F2F5F8"/>
+            <w:tcBorders>
+              <w:top w:val="single" w:sz="4" w:color="D9D9D9"/>
+              <w:left w:val="single" w:sz="4" w:color="D9D9D9"/>
+              <w:bottom w:val="single" w:sz="4" w:color="D9D9D9"/>
+              <w:right w:val="single" w:sz="4" w:color="D9D9D9"/>
+            </w:tcBorders>
+            <w:tcMar>
+              <w:top w:w="95" w:type="dxa"/>
+              <w:left w:w="95" w:type="dxa"/>
+              <w:bottom w:w="95" w:type="dxa"/>
+              <w:right w:w="95" w:type="dxa"/>
+            </w:tcMar>
+          </w:tcPr>
+          <w:p>
+            <w:pPr>
+              <w:spacing w:after="40" w:before="40" w:line="245" w:lineRule="auto"/>
+            </w:pPr>
+            <w:r>
+              <w:rPr>
+                <w:b w:val="0"/>
+                <w:color w:val="000000"/>
+                <w:sz w:val="20"/>
+              </w:rPr>
+              <w:t>4</w:t>
+            </w:r>
+          </w:p>
+        </w:tc>
+        <w:tc>
+          <w:tcPr>
+            <w:tcW w:type="dxa" w:w="2808"/>
+            <w:vAlign w:val="center"/>
+            <w:shd w:fill="F2F5F8"/>
+            <w:tcBorders>
+              <w:top w:val="single" w:sz="4" w:color="D9D9D9"/>
+              <w:left w:val="single" w:sz="4" w:color="D9D9D9"/>
+              <w:bottom w:val="single" w:sz="4" w:color="D9D9D9"/>
+              <w:right w:val="single" w:sz="4" w:color="D9D9D9"/>
+            </w:tcBorders>
+            <w:tcMar>
+              <w:top w:w="95" w:type="dxa"/>
+              <w:left w:w="95" w:type="dxa"/>
+              <w:bottom w:w="95" w:type="dxa"/>
+              <w:right w:w="95" w:type="dxa"/>
+            </w:tcMar>
+          </w:tcPr>
+          <w:p>
+            <w:pPr>
+              <w:spacing w:after="40" w:before="40" w:line="245" w:lineRule="auto"/>
+            </w:pPr>
+            <w:r>
+              <w:rPr>
+                <w:b w:val="0"/>
+                <w:color w:val="000000"/>
+                <w:sz w:val="20"/>
+              </w:rPr>
+              <w:t>0 / 7</w:t>
+            </w:r>
+          </w:p>
+        </w:tc>
+        <w:tc>
+          <w:tcPr>
+            <w:tcW w:type="dxa" w:w="2448"/>
+            <w:vAlign w:val="center"/>
+            <w:shd w:fill="F2F5F8"/>
+            <w:tcBorders>
+              <w:top w:val="single" w:sz="4" w:color="D9D9D9"/>
+              <w:left w:val="single" w:sz="4" w:color="D9D9D9"/>
+              <w:bottom w:val="single" w:sz="4" w:color="D9D9D9"/>
+              <w:right w:val="single" w:sz="4" w:color="D9D9D9"/>
+            </w:tcBorders>
+            <w:tcMar>
+              <w:top w:w="95" w:type="dxa"/>
+              <w:left w:w="95" w:type="dxa"/>
+              <w:bottom w:w="95" w:type="dxa"/>
+              <w:right w:w="95" w:type="dxa"/>
+            </w:tcMar>
+          </w:tcPr>
+          <w:p>
+            <w:pPr>
+              <w:spacing w:after="40" w:before="40" w:line="245" w:lineRule="auto"/>
+            </w:pPr>
+            <w:r>
+              <w:rPr>
+                <w:b w:val="0"/>
+                <w:color w:val="000000"/>
+                <w:sz w:val="20"/>
+              </w:rPr>
+              <w:t>0</w:t>
+            </w:r>
+          </w:p>
+        </w:tc>
+      </w:tr>
+      <w:tr>
+        <w:trPr>
+          <w:cantSplit/>
+        </w:trPr>
+        <w:tc>
+          <w:tcPr>
+            <w:tcW w:type="dxa" w:w="3600"/>
+            <w:vAlign w:val="center"/>
+            <w:shd w:fill="FFFFFF"/>
+            <w:tcBorders>
+              <w:top w:val="single" w:sz="4" w:color="D9D9D9"/>
+              <w:left w:val="single" w:sz="4" w:color="D9D9D9"/>
+              <w:bottom w:val="single" w:sz="4" w:color="D9D9D9"/>
+              <w:right w:val="single" w:sz="4" w:color="D9D9D9"/>
+            </w:tcBorders>
+            <w:tcMar>
+              <w:top w:w="95" w:type="dxa"/>
+              <w:left w:w="95" w:type="dxa"/>
+              <w:bottom w:w="95" w:type="dxa"/>
+              <w:right w:w="95" w:type="dxa"/>
+            </w:tcMar>
+          </w:tcPr>
+          <w:p>
+            <w:pPr>
+              <w:spacing w:after="40" w:before="40" w:line="245" w:lineRule="auto"/>
+            </w:pPr>
+            <w:r>
+              <w:rPr>
+                <w:b w:val="0"/>
+                <w:color w:val="000000"/>
+                <w:sz w:val="20"/>
+              </w:rPr>
+              <w:t>Exception and knowledge</w:t>
+            </w:r>
+          </w:p>
+        </w:tc>
+        <w:tc>
+          <w:tcPr>
+            <w:tcW w:type="dxa" w:w="936"/>
+            <w:vAlign w:val="center"/>
+            <w:shd w:fill="FFFFFF"/>
+            <w:tcBorders>
+              <w:top w:val="single" w:sz="4" w:color="D9D9D9"/>
+              <w:left w:val="single" w:sz="4" w:color="D9D9D9"/>
+              <w:bottom w:val="single" w:sz="4" w:color="D9D9D9"/>
+              <w:right w:val="single" w:sz="4" w:color="D9D9D9"/>
+            </w:tcBorders>
+            <w:tcMar>
+              <w:top w:w="95" w:type="dxa"/>
+              <w:left w:w="95" w:type="dxa"/>
+              <w:bottom w:w="95" w:type="dxa"/>
+              <w:right w:w="95" w:type="dxa"/>
+            </w:tcMar>
+          </w:tcPr>
+          <w:p>
+            <w:pPr>
+              <w:spacing w:after="40" w:before="40" w:line="245" w:lineRule="auto"/>
+            </w:pPr>
+            <w:r>
+              <w:rPr>
+                <w:b w:val="0"/>
+                <w:color w:val="000000"/>
+                <w:sz w:val="20"/>
+              </w:rPr>
+              <w:t>4</w:t>
+            </w:r>
+          </w:p>
+        </w:tc>
+        <w:tc>
+          <w:tcPr>
+            <w:tcW w:type="dxa" w:w="2808"/>
+            <w:vAlign w:val="center"/>
+            <w:shd w:fill="FFFFFF"/>
+            <w:tcBorders>
+              <w:top w:val="single" w:sz="4" w:color="D9D9D9"/>
+              <w:left w:val="single" w:sz="4" w:color="D9D9D9"/>
+              <w:bottom w:val="single" w:sz="4" w:color="D9D9D9"/>
+              <w:right w:val="single" w:sz="4" w:color="D9D9D9"/>
+            </w:tcBorders>
+            <w:tcMar>
+              <w:top w:w="95" w:type="dxa"/>
+              <w:left w:w="95" w:type="dxa"/>
+              <w:bottom w:w="95" w:type="dxa"/>
+              <w:right w:w="95" w:type="dxa"/>
+            </w:tcMar>
+          </w:tcPr>
+          <w:p>
+            <w:pPr>
+              <w:spacing w:after="40" w:before="40" w:line="245" w:lineRule="auto"/>
+            </w:pPr>
+            <w:r>
+              <w:rPr>
+                <w:b w:val="0"/>
+                <w:color w:val="000000"/>
+                <w:sz w:val="20"/>
+              </w:rPr>
+              <w:t>0 / 7</w:t>
+            </w:r>
+          </w:p>
+        </w:tc>
+        <w:tc>
+          <w:tcPr>
+            <w:tcW w:type="dxa" w:w="2448"/>
+            <w:vAlign w:val="center"/>
+            <w:shd w:fill="FFFFFF"/>
+            <w:tcBorders>
+              <w:top w:val="single" w:sz="4" w:color="D9D9D9"/>
+              <w:left w:val="single" w:sz="4" w:color="D9D9D9"/>
+              <w:bottom w:val="single" w:sz="4" w:color="D9D9D9"/>
+              <w:right w:val="single" w:sz="4" w:color="D9D9D9"/>
+            </w:tcBorders>
+            <w:tcMar>
+              <w:top w:w="95" w:type="dxa"/>
+              <w:left w:w="95" w:type="dxa"/>
+              <w:bottom w:w="95" w:type="dxa"/>
+              <w:right w:w="95" w:type="dxa"/>
+            </w:tcMar>
+          </w:tcPr>
+          <w:p>
+            <w:pPr>
+              <w:spacing w:after="40" w:before="40" w:line="245" w:lineRule="auto"/>
+            </w:pPr>
+            <w:r>
+              <w:rPr>
+                <w:b w:val="0"/>
+                <w:color w:val="000000"/>
+                <w:sz w:val="20"/>
+              </w:rPr>
+              <w:t>0</w:t>
+            </w:r>
+          </w:p>
+        </w:tc>
+      </w:tr>
+      <w:tr>
+        <w:trPr>
+          <w:cantSplit/>
+        </w:trPr>
+        <w:tc>
+          <w:tcPr>
+            <w:tcW w:type="dxa" w:w="3600"/>
+            <w:vAlign w:val="center"/>
+            <w:shd w:fill="F2F5F8"/>
+            <w:tcBorders>
+              <w:top w:val="single" w:sz="4" w:color="D9D9D9"/>
+              <w:left w:val="single" w:sz="4" w:color="D9D9D9"/>
+              <w:bottom w:val="single" w:sz="4" w:color="D9D9D9"/>
+              <w:right w:val="single" w:sz="4" w:color="D9D9D9"/>
+            </w:tcBorders>
+            <w:tcMar>
+              <w:top w:w="95" w:type="dxa"/>
+              <w:left w:w="95" w:type="dxa"/>
+              <w:bottom w:w="95" w:type="dxa"/>
+              <w:right w:w="95" w:type="dxa"/>
+            </w:tcMar>
+          </w:tcPr>
+          <w:p>
+            <w:pPr>
+              <w:spacing w:after="40" w:before="40" w:line="245" w:lineRule="auto"/>
+            </w:pPr>
+            <w:r>
+              <w:rPr>
+                <w:b w:val="0"/>
+                <w:color w:val="000000"/>
+                <w:sz w:val="20"/>
+              </w:rPr>
+              <w:t>Full source coverage</w:t>
+            </w:r>
+          </w:p>
+        </w:tc>
+        <w:tc>
+          <w:tcPr>
+            <w:tcW w:type="dxa" w:w="936"/>
+            <w:vAlign w:val="center"/>
+            <w:shd w:fill="F2F5F8"/>
+            <w:tcBorders>
+              <w:top w:val="single" w:sz="4" w:color="D9D9D9"/>
+              <w:left w:val="single" w:sz="4" w:color="D9D9D9"/>
+              <w:bottom w:val="single" w:sz="4" w:color="D9D9D9"/>
+              <w:right w:val="single" w:sz="4" w:color="D9D9D9"/>
+            </w:tcBorders>
+            <w:tcMar>
+              <w:top w:w="95" w:type="dxa"/>
+              <w:left w:w="95" w:type="dxa"/>
+              <w:bottom w:w="95" w:type="dxa"/>
+              <w:right w:w="95" w:type="dxa"/>
+            </w:tcMar>
+          </w:tcPr>
+          <w:p>
+            <w:pPr>
+              <w:spacing w:after="40" w:before="40" w:line="245" w:lineRule="auto"/>
+            </w:pPr>
+            <w:r>
+              <w:rPr>
+                <w:b w:val="0"/>
+                <w:color w:val="000000"/>
+                <w:sz w:val="20"/>
+              </w:rPr>
+              <w:t>2</w:t>
+            </w:r>
+          </w:p>
+        </w:tc>
+        <w:tc>
+          <w:tcPr>
+            <w:tcW w:type="dxa" w:w="2808"/>
+            <w:vAlign w:val="center"/>
+            <w:shd w:fill="F2F5F8"/>
+            <w:tcBorders>
+              <w:top w:val="single" w:sz="4" w:color="D9D9D9"/>
+              <w:left w:val="single" w:sz="4" w:color="D9D9D9"/>
+              <w:bottom w:val="single" w:sz="4" w:color="D9D9D9"/>
+              <w:right w:val="single" w:sz="4" w:color="D9D9D9"/>
+            </w:tcBorders>
+            <w:tcMar>
+              <w:top w:w="95" w:type="dxa"/>
+              <w:left w:w="95" w:type="dxa"/>
+              <w:bottom w:w="95" w:type="dxa"/>
+              <w:right w:w="95" w:type="dxa"/>
+            </w:tcMar>
+          </w:tcPr>
+          <w:p>
+            <w:pPr>
+              <w:spacing w:after="40" w:before="40" w:line="245" w:lineRule="auto"/>
+            </w:pPr>
+            <w:r>
+              <w:rPr>
+                <w:b w:val="0"/>
+                <w:color w:val="000000"/>
+                <w:sz w:val="20"/>
+              </w:rPr>
+              <w:t>2 / 2</w:t>
+            </w:r>
+          </w:p>
+        </w:tc>
+        <w:tc>
+          <w:tcPr>
+            <w:tcW w:type="dxa" w:w="2448"/>
+            <w:vAlign w:val="center"/>
+            <w:shd w:fill="F2F5F8"/>
+            <w:tcBorders>
+              <w:top w:val="single" w:sz="4" w:color="D9D9D9"/>
+              <w:left w:val="single" w:sz="4" w:color="D9D9D9"/>
+              <w:bottom w:val="single" w:sz="4" w:color="D9D9D9"/>
+              <w:right w:val="single" w:sz="4" w:color="D9D9D9"/>
+            </w:tcBorders>
+            <w:tcMar>
+              <w:top w:w="95" w:type="dxa"/>
+              <w:left w:w="95" w:type="dxa"/>
+              <w:bottom w:w="95" w:type="dxa"/>
+              <w:right w:w="95" w:type="dxa"/>
+            </w:tcMar>
+          </w:tcPr>
+          <w:p>
+            <w:pPr>
+              <w:spacing w:after="40" w:before="40" w:line="245" w:lineRule="auto"/>
+            </w:pPr>
+            <w:r>
+              <w:rPr>
+                <w:b w:val="0"/>
+                <w:color w:val="000000"/>
+                <w:sz w:val="20"/>
+              </w:rPr>
+              <w:t>0</w:t>
+            </w:r>
+          </w:p>
+        </w:tc>
+      </w:tr>
+    </w:tbl>
+    <w:p>
+      <w:pPr>
+        <w:spacing w:after="20"/>
+      </w:pPr>
+    </w:p>
+    <w:p>
+      <w:r>
+        <w:t>The source-coverage misses are a conditional signup-date policy and email syntax. Both records satisfy the supplied JSON checks, so the app reaches repair approval despite those omitted requirements. The evaluator withholds approval; a clean validation result is not evidence that the full business policy has been covered.</w:t>
+      </w:r>
+    </w:p>
+    <w:tbl>
+      <w:tblPr>
+        <w:tblW w:type="auto" w:w="0"/>
+        <w:tblLayout w:type="fixed"/>
+        <w:tblLook w:firstColumn="1" w:firstRow="1" w:lastColumn="0" w:lastRow="0" w:noHBand="0" w:noVBand="1" w:val="04A0"/>
+      </w:tblPr>
+      <w:tblGrid>
+        <w:gridCol w:w="2736"/>
+        <w:gridCol w:w="1872"/>
+        <w:gridCol w:w="2376"/>
+        <w:gridCol w:w="2808"/>
+      </w:tblGrid>
+      <w:tr>
+        <w:trPr>
+          <w:cantSplit/>
+          <w:tblHeader/>
+        </w:trPr>
+        <w:tc>
+          <w:tcPr>
+            <w:tcW w:type="dxa" w:w="2736"/>
+            <w:vAlign w:val="center"/>
+            <w:shd w:fill="263A52"/>
+            <w:tcBorders>
+              <w:top w:val="single" w:sz="4" w:color="D9D9D9"/>
+              <w:left w:val="single" w:sz="4" w:color="D9D9D9"/>
+              <w:bottom w:val="single" w:sz="4" w:color="D9D9D9"/>
+              <w:right w:val="single" w:sz="4" w:color="D9D9D9"/>
+            </w:tcBorders>
+            <w:tcMar>
+              <w:top w:w="95" w:type="dxa"/>
+              <w:left w:w="95" w:type="dxa"/>
+              <w:bottom w:w="95" w:type="dxa"/>
+              <w:right w:w="95" w:type="dxa"/>
+            </w:tcMar>
+          </w:tcPr>
+          <w:p>
+            <w:pPr>
+              <w:spacing w:after="40" w:before="40" w:line="245" w:lineRule="auto"/>
+            </w:pPr>
+            <w:r>
+              <w:rPr>
+                <w:b/>
+                <w:color w:val="FFFFFF"/>
+                <w:sz w:val="20"/>
+              </w:rPr>
+              <w:t>Value cohort</w:t>
+            </w:r>
+          </w:p>
+        </w:tc>
+        <w:tc>
+          <w:tcPr>
+            <w:tcW w:type="dxa" w:w="1872"/>
+            <w:vAlign w:val="center"/>
+            <w:shd w:fill="263A52"/>
+            <w:tcBorders>
+              <w:top w:val="single" w:sz="4" w:color="D9D9D9"/>
+              <w:left w:val="single" w:sz="4" w:color="D9D9D9"/>
+              <w:bottom w:val="single" w:sz="4" w:color="D9D9D9"/>
+              <w:right w:val="single" w:sz="4" w:color="D9D9D9"/>
+            </w:tcBorders>
+            <w:tcMar>
+              <w:top w:w="95" w:type="dxa"/>
+              <w:left w:w="95" w:type="dxa"/>
+              <w:bottom w:w="95" w:type="dxa"/>
+              <w:right w:w="95" w:type="dxa"/>
+            </w:tcMar>
+          </w:tcPr>
+          <w:p>
+            <w:pPr>
+              <w:spacing w:after="40" w:before="40" w:line="245" w:lineRule="auto"/>
+            </w:pPr>
+            <w:r>
+              <w:rPr>
+                <w:b/>
+                <w:color w:val="FFFFFF"/>
+                <w:sz w:val="20"/>
+              </w:rPr>
+              <w:t>Stage</w:t>
+            </w:r>
+          </w:p>
+        </w:tc>
+        <w:tc>
+          <w:tcPr>
+            <w:tcW w:type="dxa" w:w="2376"/>
+            <w:vAlign w:val="center"/>
+            <w:shd w:fill="263A52"/>
+            <w:tcBorders>
+              <w:top w:val="single" w:sz="4" w:color="D9D9D9"/>
+              <w:left w:val="single" w:sz="4" w:color="D9D9D9"/>
+              <w:bottom w:val="single" w:sz="4" w:color="D9D9D9"/>
+              <w:right w:val="single" w:sz="4" w:color="D9D9D9"/>
+            </w:tcBorders>
+            <w:tcMar>
+              <w:top w:w="95" w:type="dxa"/>
+              <w:left w:w="95" w:type="dxa"/>
+              <w:bottom w:w="95" w:type="dxa"/>
+              <w:right w:w="95" w:type="dxa"/>
+            </w:tcMar>
+          </w:tcPr>
+          <w:p>
+            <w:pPr>
+              <w:spacing w:after="40" w:before="40" w:line="245" w:lineRule="auto"/>
+            </w:pPr>
+            <w:r>
+              <w:rPr>
+                <w:b/>
+                <w:color w:val="FFFFFF"/>
+                <w:sz w:val="20"/>
+              </w:rPr>
+              <w:t>Wrong / proposed</w:t>
+            </w:r>
+          </w:p>
+        </w:tc>
+        <w:tc>
+          <w:tcPr>
+            <w:tcW w:type="dxa" w:w="2808"/>
+            <w:vAlign w:val="center"/>
+            <w:shd w:fill="263A52"/>
+            <w:tcBorders>
+              <w:top w:val="single" w:sz="4" w:color="D9D9D9"/>
+              <w:left w:val="single" w:sz="4" w:color="D9D9D9"/>
+              <w:bottom w:val="single" w:sz="4" w:color="D9D9D9"/>
+              <w:right w:val="single" w:sz="4" w:color="D9D9D9"/>
+            </w:tcBorders>
+            <w:tcMar>
+              <w:top w:w="95" w:type="dxa"/>
+              <w:left w:w="95" w:type="dxa"/>
+              <w:bottom w:w="95" w:type="dxa"/>
+              <w:right w:w="95" w:type="dxa"/>
+            </w:tcMar>
+          </w:tcPr>
+          <w:p>
+            <w:pPr>
+              <w:spacing w:after="40" w:before="40" w:line="245" w:lineRule="auto"/>
+            </w:pPr>
+            <w:r>
+              <w:rPr>
+                <w:b/>
+                <w:color w:val="FFFFFF"/>
+                <w:sz w:val="20"/>
+              </w:rPr>
+              <w:t>Refused / answerable</w:t>
+            </w:r>
+          </w:p>
+        </w:tc>
+      </w:tr>
+      <w:tr>
+        <w:trPr>
+          <w:cantSplit/>
+        </w:trPr>
+        <w:tc>
+          <w:tcPr>
+            <w:tcW w:type="dxa" w:w="2736"/>
+            <w:vAlign w:val="center"/>
+            <w:shd w:fill="FFFFFF"/>
+            <w:tcBorders>
+              <w:top w:val="single" w:sz="4" w:color="D9D9D9"/>
+              <w:left w:val="single" w:sz="4" w:color="D9D9D9"/>
+              <w:bottom w:val="single" w:sz="4" w:color="D9D9D9"/>
+              <w:right w:val="single" w:sz="4" w:color="D9D9D9"/>
+            </w:tcBorders>
+            <w:tcMar>
+              <w:top w:w="95" w:type="dxa"/>
+              <w:left w:w="95" w:type="dxa"/>
+              <w:bottom w:w="95" w:type="dxa"/>
+              <w:right w:w="95" w:type="dxa"/>
+            </w:tcMar>
+          </w:tcPr>
+          <w:p>
+            <w:pPr>
+              <w:spacing w:after="40" w:before="40" w:line="245" w:lineRule="auto"/>
+            </w:pPr>
+            <w:r>
+              <w:rPr>
+                <w:b w:val="0"/>
+                <w:color w:val="000000"/>
+                <w:sz w:val="20"/>
+              </w:rPr>
+              <w:t>Semantic repairs</w:t>
+            </w:r>
+          </w:p>
+        </w:tc>
+        <w:tc>
+          <w:tcPr>
+            <w:tcW w:type="dxa" w:w="1872"/>
+            <w:vAlign w:val="center"/>
+            <w:shd w:fill="FFFFFF"/>
+            <w:tcBorders>
+              <w:top w:val="single" w:sz="4" w:color="D9D9D9"/>
+              <w:left w:val="single" w:sz="4" w:color="D9D9D9"/>
+              <w:bottom w:val="single" w:sz="4" w:color="D9D9D9"/>
+              <w:right w:val="single" w:sz="4" w:color="D9D9D9"/>
+            </w:tcBorders>
+            <w:tcMar>
+              <w:top w:w="95" w:type="dxa"/>
+              <w:left w:w="95" w:type="dxa"/>
+              <w:bottom w:w="95" w:type="dxa"/>
+              <w:right w:w="95" w:type="dxa"/>
+            </w:tcMar>
+          </w:tcPr>
+          <w:p>
+            <w:pPr>
+              <w:spacing w:after="40" w:before="40" w:line="245" w:lineRule="auto"/>
+            </w:pPr>
+            <w:r>
+              <w:rPr>
+                <w:b w:val="0"/>
+                <w:color w:val="000000"/>
+                <w:sz w:val="20"/>
+              </w:rPr>
+              <w:t>Raw model</w:t>
+            </w:r>
+          </w:p>
+        </w:tc>
+        <w:tc>
+          <w:tcPr>
+            <w:tcW w:type="dxa" w:w="2376"/>
+            <w:vAlign w:val="center"/>
+            <w:shd w:fill="FFFFFF"/>
+            <w:tcBorders>
+              <w:top w:val="single" w:sz="4" w:color="D9D9D9"/>
+              <w:left w:val="single" w:sz="4" w:color="D9D9D9"/>
+              <w:bottom w:val="single" w:sz="4" w:color="D9D9D9"/>
+              <w:right w:val="single" w:sz="4" w:color="D9D9D9"/>
+            </w:tcBorders>
+            <w:tcMar>
+              <w:top w:w="95" w:type="dxa"/>
+              <w:left w:w="95" w:type="dxa"/>
+              <w:bottom w:w="95" w:type="dxa"/>
+              <w:right w:w="95" w:type="dxa"/>
+            </w:tcMar>
+          </w:tcPr>
+          <w:p>
+            <w:pPr>
+              <w:spacing w:after="40" w:before="40" w:line="245" w:lineRule="auto"/>
+            </w:pPr>
+            <w:r>
+              <w:rPr>
+                <w:b w:val="0"/>
+                <w:color w:val="000000"/>
+                <w:sz w:val="20"/>
+              </w:rPr>
+              <w:t>0 / 7</w:t>
+            </w:r>
+          </w:p>
+        </w:tc>
+        <w:tc>
+          <w:tcPr>
+            <w:tcW w:type="dxa" w:w="2808"/>
+            <w:vAlign w:val="center"/>
+            <w:shd w:fill="FFFFFF"/>
+            <w:tcBorders>
+              <w:top w:val="single" w:sz="4" w:color="D9D9D9"/>
+              <w:left w:val="single" w:sz="4" w:color="D9D9D9"/>
+              <w:bottom w:val="single" w:sz="4" w:color="D9D9D9"/>
+              <w:right w:val="single" w:sz="4" w:color="D9D9D9"/>
+            </w:tcBorders>
+            <w:tcMar>
+              <w:top w:w="95" w:type="dxa"/>
+              <w:left w:w="95" w:type="dxa"/>
+              <w:bottom w:w="95" w:type="dxa"/>
+              <w:right w:w="95" w:type="dxa"/>
+            </w:tcMar>
+          </w:tcPr>
+          <w:p>
+            <w:pPr>
+              <w:spacing w:after="40" w:before="40" w:line="245" w:lineRule="auto"/>
+            </w:pPr>
+            <w:r>
+              <w:rPr>
+                <w:b w:val="0"/>
+                <w:color w:val="000000"/>
+                <w:sz w:val="20"/>
+              </w:rPr>
+              <w:t>0 / 7</w:t>
+            </w:r>
+          </w:p>
+        </w:tc>
+      </w:tr>
+      <w:tr>
+        <w:trPr>
+          <w:cantSplit/>
+        </w:trPr>
+        <w:tc>
+          <w:tcPr>
+            <w:tcW w:type="dxa" w:w="2736"/>
+            <w:vAlign w:val="center"/>
+            <w:shd w:fill="F2F5F8"/>
+            <w:tcBorders>
+              <w:top w:val="single" w:sz="4" w:color="D9D9D9"/>
+              <w:left w:val="single" w:sz="4" w:color="D9D9D9"/>
+              <w:bottom w:val="single" w:sz="4" w:color="D9D9D9"/>
+              <w:right w:val="single" w:sz="4" w:color="D9D9D9"/>
+            </w:tcBorders>
+            <w:tcMar>
+              <w:top w:w="95" w:type="dxa"/>
+              <w:left w:w="95" w:type="dxa"/>
+              <w:bottom w:w="95" w:type="dxa"/>
+              <w:right w:w="95" w:type="dxa"/>
+            </w:tcMar>
+          </w:tcPr>
+          <w:p>
+            <w:pPr>
+              <w:spacing w:after="40" w:before="40" w:line="245" w:lineRule="auto"/>
+            </w:pPr>
+            <w:r>
+              <w:rPr>
+                <w:b w:val="0"/>
+                <w:color w:val="000000"/>
+                <w:sz w:val="20"/>
+              </w:rPr>
+              <w:t>Semantic repairs</w:t>
+            </w:r>
+          </w:p>
+        </w:tc>
+        <w:tc>
+          <w:tcPr>
+            <w:tcW w:type="dxa" w:w="1872"/>
+            <w:vAlign w:val="center"/>
+            <w:shd w:fill="F2F5F8"/>
+            <w:tcBorders>
+              <w:top w:val="single" w:sz="4" w:color="D9D9D9"/>
+              <w:left w:val="single" w:sz="4" w:color="D9D9D9"/>
+              <w:bottom w:val="single" w:sz="4" w:color="D9D9D9"/>
+              <w:right w:val="single" w:sz="4" w:color="D9D9D9"/>
+            </w:tcBorders>
+            <w:tcMar>
+              <w:top w:w="95" w:type="dxa"/>
+              <w:left w:w="95" w:type="dxa"/>
+              <w:bottom w:w="95" w:type="dxa"/>
+              <w:right w:w="95" w:type="dxa"/>
+            </w:tcMar>
+          </w:tcPr>
+          <w:p>
+            <w:pPr>
+              <w:spacing w:after="40" w:before="40" w:line="245" w:lineRule="auto"/>
+            </w:pPr>
+            <w:r>
+              <w:rPr>
+                <w:b w:val="0"/>
+                <w:color w:val="000000"/>
+                <w:sz w:val="20"/>
+              </w:rPr>
+              <w:t>After safeguards</w:t>
+            </w:r>
+          </w:p>
+        </w:tc>
+        <w:tc>
+          <w:tcPr>
+            <w:tcW w:type="dxa" w:w="2376"/>
+            <w:vAlign w:val="center"/>
+            <w:shd w:fill="F2F5F8"/>
+            <w:tcBorders>
+              <w:top w:val="single" w:sz="4" w:color="D9D9D9"/>
+              <w:left w:val="single" w:sz="4" w:color="D9D9D9"/>
+              <w:bottom w:val="single" w:sz="4" w:color="D9D9D9"/>
+              <w:right w:val="single" w:sz="4" w:color="D9D9D9"/>
+            </w:tcBorders>
+            <w:tcMar>
+              <w:top w:w="95" w:type="dxa"/>
+              <w:left w:w="95" w:type="dxa"/>
+              <w:bottom w:w="95" w:type="dxa"/>
+              <w:right w:w="95" w:type="dxa"/>
+            </w:tcMar>
+          </w:tcPr>
+          <w:p>
+            <w:pPr>
+              <w:spacing w:after="40" w:before="40" w:line="245" w:lineRule="auto"/>
+            </w:pPr>
+            <w:r>
+              <w:rPr>
+                <w:b w:val="0"/>
+                <w:color w:val="000000"/>
+                <w:sz w:val="20"/>
+              </w:rPr>
+              <w:t>0 / 7</w:t>
+            </w:r>
+          </w:p>
+        </w:tc>
+        <w:tc>
+          <w:tcPr>
+            <w:tcW w:type="dxa" w:w="2808"/>
+            <w:vAlign w:val="center"/>
+            <w:shd w:fill="F2F5F8"/>
+            <w:tcBorders>
+              <w:top w:val="single" w:sz="4" w:color="D9D9D9"/>
+              <w:left w:val="single" w:sz="4" w:color="D9D9D9"/>
+              <w:bottom w:val="single" w:sz="4" w:color="D9D9D9"/>
+              <w:right w:val="single" w:sz="4" w:color="D9D9D9"/>
+            </w:tcBorders>
+            <w:tcMar>
+              <w:top w:w="95" w:type="dxa"/>
+              <w:left w:w="95" w:type="dxa"/>
+              <w:bottom w:w="95" w:type="dxa"/>
+              <w:right w:w="95" w:type="dxa"/>
+            </w:tcMar>
+          </w:tcPr>
+          <w:p>
+            <w:pPr>
+              <w:spacing w:after="40" w:before="40" w:line="245" w:lineRule="auto"/>
+            </w:pPr>
+            <w:r>
+              <w:rPr>
+                <w:b w:val="0"/>
+                <w:color w:val="000000"/>
+                <w:sz w:val="20"/>
+              </w:rPr>
+              <w:t>0 / 7</w:t>
+            </w:r>
+          </w:p>
+        </w:tc>
+      </w:tr>
+      <w:tr>
+        <w:trPr>
+          <w:cantSplit/>
+        </w:trPr>
+        <w:tc>
+          <w:tcPr>
+            <w:tcW w:type="dxa" w:w="2736"/>
+            <w:vAlign w:val="center"/>
+            <w:shd w:fill="FFFFFF"/>
+            <w:tcBorders>
+              <w:top w:val="single" w:sz="4" w:color="D9D9D9"/>
+              <w:left w:val="single" w:sz="4" w:color="D9D9D9"/>
+              <w:bottom w:val="single" w:sz="4" w:color="D9D9D9"/>
+              <w:right w:val="single" w:sz="4" w:color="D9D9D9"/>
+            </w:tcBorders>
+            <w:tcMar>
+              <w:top w:w="95" w:type="dxa"/>
+              <w:left w:w="95" w:type="dxa"/>
+              <w:bottom w:w="95" w:type="dxa"/>
+              <w:right w:w="95" w:type="dxa"/>
+            </w:tcMar>
+          </w:tcPr>
+          <w:p>
+            <w:pPr>
+              <w:spacing w:after="40" w:before="40" w:line="245" w:lineRule="auto"/>
+            </w:pPr>
+            <w:r>
+              <w:rPr>
+                <w:b w:val="0"/>
+                <w:color w:val="000000"/>
+                <w:sz w:val="20"/>
+              </w:rPr>
+              <w:t>Exception and knowledge</w:t>
+            </w:r>
+          </w:p>
+        </w:tc>
+        <w:tc>
+          <w:tcPr>
+            <w:tcW w:type="dxa" w:w="1872"/>
+            <w:vAlign w:val="center"/>
+            <w:shd w:fill="FFFFFF"/>
+            <w:tcBorders>
+              <w:top w:val="single" w:sz="4" w:color="D9D9D9"/>
+              <w:left w:val="single" w:sz="4" w:color="D9D9D9"/>
+              <w:bottom w:val="single" w:sz="4" w:color="D9D9D9"/>
+              <w:right w:val="single" w:sz="4" w:color="D9D9D9"/>
+            </w:tcBorders>
+            <w:tcMar>
+              <w:top w:w="95" w:type="dxa"/>
+              <w:left w:w="95" w:type="dxa"/>
+              <w:bottom w:w="95" w:type="dxa"/>
+              <w:right w:w="95" w:type="dxa"/>
+            </w:tcMar>
+          </w:tcPr>
+          <w:p>
+            <w:pPr>
+              <w:spacing w:after="40" w:before="40" w:line="245" w:lineRule="auto"/>
+            </w:pPr>
+            <w:r>
+              <w:rPr>
+                <w:b w:val="0"/>
+                <w:color w:val="000000"/>
+                <w:sz w:val="20"/>
+              </w:rPr>
+              <w:t>Raw model</w:t>
+            </w:r>
+          </w:p>
+        </w:tc>
+        <w:tc>
+          <w:tcPr>
+            <w:tcW w:type="dxa" w:w="2376"/>
+            <w:vAlign w:val="center"/>
+            <w:shd w:fill="FFFFFF"/>
+            <w:tcBorders>
+              <w:top w:val="single" w:sz="4" w:color="D9D9D9"/>
+              <w:left w:val="single" w:sz="4" w:color="D9D9D9"/>
+              <w:bottom w:val="single" w:sz="4" w:color="D9D9D9"/>
+              <w:right w:val="single" w:sz="4" w:color="D9D9D9"/>
+            </w:tcBorders>
+            <w:tcMar>
+              <w:top w:w="95" w:type="dxa"/>
+              <w:left w:w="95" w:type="dxa"/>
+              <w:bottom w:w="95" w:type="dxa"/>
+              <w:right w:w="95" w:type="dxa"/>
+            </w:tcMar>
+          </w:tcPr>
+          <w:p>
+            <w:pPr>
+              <w:spacing w:after="40" w:before="40" w:line="245" w:lineRule="auto"/>
+            </w:pPr>
+            <w:r>
+              <w:rPr>
+                <w:b w:val="0"/>
+                <w:color w:val="000000"/>
+                <w:sz w:val="20"/>
+              </w:rPr>
+              <w:t>1 / 1</w:t>
+            </w:r>
+          </w:p>
+        </w:tc>
+        <w:tc>
+          <w:tcPr>
+            <w:tcW w:type="dxa" w:w="2808"/>
+            <w:vAlign w:val="center"/>
+            <w:shd w:fill="FFFFFF"/>
+            <w:tcBorders>
+              <w:top w:val="single" w:sz="4" w:color="D9D9D9"/>
+              <w:left w:val="single" w:sz="4" w:color="D9D9D9"/>
+              <w:bottom w:val="single" w:sz="4" w:color="D9D9D9"/>
+              <w:right w:val="single" w:sz="4" w:color="D9D9D9"/>
+            </w:tcBorders>
+            <w:tcMar>
+              <w:top w:w="95" w:type="dxa"/>
+              <w:left w:w="95" w:type="dxa"/>
+              <w:bottom w:w="95" w:type="dxa"/>
+              <w:right w:w="95" w:type="dxa"/>
+            </w:tcMar>
+          </w:tcPr>
+          <w:p>
+            <w:pPr>
+              <w:spacing w:after="40" w:before="40" w:line="245" w:lineRule="auto"/>
+            </w:pPr>
+            <w:r>
+              <w:rPr>
+                <w:b w:val="0"/>
+                <w:color w:val="000000"/>
+                <w:sz w:val="20"/>
+              </w:rPr>
+              <w:t>Not applicable</w:t>
+            </w:r>
+          </w:p>
+        </w:tc>
+      </w:tr>
+      <w:tr>
+        <w:trPr>
+          <w:cantSplit/>
+        </w:trPr>
+        <w:tc>
+          <w:tcPr>
+            <w:tcW w:type="dxa" w:w="2736"/>
+            <w:vAlign w:val="center"/>
+            <w:shd w:fill="F2F5F8"/>
+            <w:tcBorders>
+              <w:top w:val="single" w:sz="4" w:color="D9D9D9"/>
+              <w:left w:val="single" w:sz="4" w:color="D9D9D9"/>
+              <w:bottom w:val="single" w:sz="4" w:color="D9D9D9"/>
+              <w:right w:val="single" w:sz="4" w:color="D9D9D9"/>
+            </w:tcBorders>
+            <w:tcMar>
+              <w:top w:w="95" w:type="dxa"/>
+              <w:left w:w="95" w:type="dxa"/>
+              <w:bottom w:w="95" w:type="dxa"/>
+              <w:right w:w="95" w:type="dxa"/>
+            </w:tcMar>
+          </w:tcPr>
+          <w:p>
+            <w:pPr>
+              <w:spacing w:after="40" w:before="40" w:line="245" w:lineRule="auto"/>
+            </w:pPr>
+            <w:r>
+              <w:rPr>
+                <w:b w:val="0"/>
+                <w:color w:val="000000"/>
+                <w:sz w:val="20"/>
+              </w:rPr>
+              <w:t>Exception and knowledge</w:t>
+            </w:r>
+          </w:p>
+        </w:tc>
+        <w:tc>
+          <w:tcPr>
+            <w:tcW w:type="dxa" w:w="1872"/>
+            <w:vAlign w:val="center"/>
+            <w:shd w:fill="F2F5F8"/>
+            <w:tcBorders>
+              <w:top w:val="single" w:sz="4" w:color="D9D9D9"/>
+              <w:left w:val="single" w:sz="4" w:color="D9D9D9"/>
+              <w:bottom w:val="single" w:sz="4" w:color="D9D9D9"/>
+              <w:right w:val="single" w:sz="4" w:color="D9D9D9"/>
+            </w:tcBorders>
+            <w:tcMar>
+              <w:top w:w="95" w:type="dxa"/>
+              <w:left w:w="95" w:type="dxa"/>
+              <w:bottom w:w="95" w:type="dxa"/>
+              <w:right w:w="95" w:type="dxa"/>
+            </w:tcMar>
+          </w:tcPr>
+          <w:p>
+            <w:pPr>
+              <w:spacing w:after="40" w:before="40" w:line="245" w:lineRule="auto"/>
+            </w:pPr>
+            <w:r>
+              <w:rPr>
+                <w:b w:val="0"/>
+                <w:color w:val="000000"/>
+                <w:sz w:val="20"/>
+              </w:rPr>
+              <w:t>After safeguards</w:t>
+            </w:r>
+          </w:p>
+        </w:tc>
+        <w:tc>
+          <w:tcPr>
+            <w:tcW w:type="dxa" w:w="2376"/>
+            <w:vAlign w:val="center"/>
+            <w:shd w:fill="F2F5F8"/>
+            <w:tcBorders>
+              <w:top w:val="single" w:sz="4" w:color="D9D9D9"/>
+              <w:left w:val="single" w:sz="4" w:color="D9D9D9"/>
+              <w:bottom w:val="single" w:sz="4" w:color="D9D9D9"/>
+              <w:right w:val="single" w:sz="4" w:color="D9D9D9"/>
+            </w:tcBorders>
+            <w:tcMar>
+              <w:top w:w="95" w:type="dxa"/>
+              <w:left w:w="95" w:type="dxa"/>
+              <w:bottom w:w="95" w:type="dxa"/>
+              <w:right w:w="95" w:type="dxa"/>
+            </w:tcMar>
+          </w:tcPr>
+          <w:p>
+            <w:pPr>
+              <w:spacing w:after="40" w:before="40" w:line="245" w:lineRule="auto"/>
+            </w:pPr>
+            <w:r>
+              <w:rPr>
+                <w:b w:val="0"/>
+                <w:color w:val="000000"/>
+                <w:sz w:val="20"/>
+              </w:rPr>
+              <w:t>1 / 1</w:t>
+            </w:r>
+          </w:p>
+        </w:tc>
+        <w:tc>
+          <w:tcPr>
+            <w:tcW w:type="dxa" w:w="2808"/>
+            <w:vAlign w:val="center"/>
+            <w:shd w:fill="F2F5F8"/>
+            <w:tcBorders>
+              <w:top w:val="single" w:sz="4" w:color="D9D9D9"/>
+              <w:left w:val="single" w:sz="4" w:color="D9D9D9"/>
+              <w:bottom w:val="single" w:sz="4" w:color="D9D9D9"/>
+              <w:right w:val="single" w:sz="4" w:color="D9D9D9"/>
+            </w:tcBorders>
+            <w:tcMar>
+              <w:top w:w="95" w:type="dxa"/>
+              <w:left w:w="95" w:type="dxa"/>
+              <w:bottom w:w="95" w:type="dxa"/>
+              <w:right w:w="95" w:type="dxa"/>
+            </w:tcMar>
+          </w:tcPr>
+          <w:p>
+            <w:pPr>
+              <w:spacing w:after="40" w:before="40" w:line="245" w:lineRule="auto"/>
+            </w:pPr>
+            <w:r>
+              <w:rPr>
+                <w:b w:val="0"/>
+                <w:color w:val="000000"/>
+                <w:sz w:val="20"/>
+              </w:rPr>
+              <w:t>Not applicable</w:t>
+            </w:r>
+          </w:p>
+        </w:tc>
+      </w:tr>
+    </w:tbl>
+    <w:p>
+      <w:pPr>
+        <w:spacing w:after="20"/>
+      </w:pPr>
+    </w:p>
+    <w:p>
+      <w:r>
+        <w:t>The factual error total includes 0 incorrect or unsupported determinate proposals and 1 date hypothesis inconsistent with the hidden source ledger. Nebius suggested 2027-02-28; the fixture ledger specifies 2027-03-01. Raw item coverage was 14 of 14 requested cells. Six unknown-fact cells received necessary abstentions.</w:t>
+      </w:r>
+    </w:p>
+    <w:p>
+      <w:r>
+        <w:t>The declared-rule investigator selected 7 of 7 expected transformations. Scripted review produced 11 exact corrected outputs with original files preserved and two approvals each. This measures the combined workflow with known reviewer facts, not autonomous correction accuracy.</w:t>
+      </w:r>
+    </w:p>
+    <w:p>
+      <w:r>
+        <w:t>The initial run made 75 model requests and reported 81357 total tokens. Its final case hit the evaluator's 75-request cap, a local stop rather than a provider refusal. The targeted retry is retained separately in docs/evaluations/nebius-coverage-retry-v1.json; the original result is unchanged. The retry also exposes the email coverage gap.</w:t>
+      </w:r>
+    </w:p>
+    <w:p>
+      <w:r>
+        <w:t>Practical follow-up: review the full source policy before treating a rules file as complete; extend the schema for conditional date ranges and email syntax; keep factual date confirmation in the human review step; and repeat the study with independently labeled cases before making broad reliability claims.</w:t>
+      </w:r>
+    </w:p>
+    <w:p>
+      <w:r>
+        <w:t>These small, deliberately constructed samples describe this run only. They do not establish a stable refusal rate, production accuracy or real-user completion time. The previous offline figures remain separate. Six new evaluator tests passed, including checks that missing responses are not mislabeled as refusals. No production validation behavior was changed by this study.</w:t>
       </w:r>
     </w:p>
     <w:p>

</xml_diff>

<commit_message>
Document policy fixes and publish separate Nebius rerun evidence
</commit_message>
<xml_diff>
--- a/docs/Lumen-Row-Project-Documentation.docx
+++ b/docs/Lumen-Row-Project-Documentation.docx
@@ -61,7 +61,7 @@
     </w:p>
     <w:p>
       <w:r>
-        <w:t>This release accepts CSV, TSV, XLSX, flat JSON, JSONL and NDJSON, then normalizes one table for customer-import checks. It supports required fields, uniqueness, exact duplicates, declared date formats, category aliases and export-safety checks. Output is a new CSV with an audit JSON and validation summary.</w:t>
+        <w:t>This release accepts CSV, TSV, XLSX, flat JSON, JSONL and NDJSON, then normalizes one table for customer-import checks. It supports required fields, uniqueness, exact duplicates, declared date formats, category aliases, optional email syntax, conditional date bounds and export-safety checks. Output is a new CSV with an audit JSON and validation summary.</w:t>
       </w:r>
     </w:p>
     <w:p>
@@ -1554,7 +1554,7 @@
                 <w:color w:val="000000"/>
                 <w:sz w:val="20"/>
               </w:rPr>
-              <w:t>Show the blocking finding and ask for a known correction. A valid-looking hypothesis is still unverified.</w:t>
+              <w:t>Show the blocking finding and ask for a known correction. Do not invent a date or infer a country from an unknown marker.</w:t>
             </w:r>
           </w:p>
         </w:tc>
@@ -1943,7 +1943,7 @@
     </w:p>
     <w:p>
       <w:r>
-        <w:t>All committed examples are fictional and use example.com addresses. No real customer jobs, API credentials, local databases or generated user outputs are part of the repository.</w:t>
+        <w:t>All committed examples are fictional and use illustrative email addresses. No real customer jobs, API credentials, local databases or generated user outputs are part of the repository.</w:t>
       </w:r>
     </w:p>
     <w:tbl>
@@ -2805,7 +2805,7 @@
                 <w:color w:val="000000"/>
                 <w:sz w:val="20"/>
               </w:rPr>
-              <w:t>Required email does not mean email syntax or ownership is checked. A passing date format does not prove the intended signup date.</w:t>
+              <w:t>Required email only checks presence. Opt into email_columns for syntax and conditional_dates for matching-record date bounds. Neither verifies ownership or factual truth.</w:t>
             </w:r>
           </w:p>
         </w:tc>
@@ -2875,12 +2875,12 @@
         <w:pStyle w:val="Caption"/>
       </w:pPr>
       <w:r>
-        <w:t>Figure 2. Compact suggestion and correction tables with fictional data. This UI capture uses controlled suggestions; live model wording may differ.</w:t>
+        <w:t>Figure 2. Historical UI capture with controlled suggestions. The date hypothesis shown here is now withheld; impossible dates require source confirmation.</w:t>
       </w:r>
     </w:p>
     <w:p>
       <w:r>
-        <w:t>Prepare AI-assisted draft includes all affected fields. In live mode, inspect the payload preview and authorize the request first. Add available suggestions to draft, then review or edit the final correction table. Country and identifier values remain blank when there is no evidence; a suggested month-end date still needs confirmation.</w:t>
+        <w:t>Prepare AI-assisted draft includes all affected fields. In live mode, inspect the payload preview and authorize the request first. Add available suggestions to draft, then review or edit the final correction table. Unknown countries, identifiers and impossible dates remain blank. Confirm the intended date from a trusted source, then choose it in the calendar; do not assume a month-end correction.</w:t>
       </w:r>
     </w:p>
     <w:tbl>
@@ -3931,7 +3931,7 @@
     </w:p>
     <w:p>
       <w:r>
-        <w:t>Release verification on 25 October 2026: 422 automated tests passed, with 0 failures and 0 errors. The ten-case offline evaluation completed 10 of 10 scenarios with exact expected outputs; the slowest case took 1.047 seconds on the local test machine.</w:t>
+        <w:t>Release verification on 25 October 2026: 457 automated tests passed, with 0 failures and 0 errors. The ten-case offline evaluation completed 10 of 10 scenarios with exact expected outputs; the slowest case took 1.047 seconds on the local test machine.</w:t>
       </w:r>
     </w:p>
     <w:tbl>
@@ -4404,7 +4404,7 @@
         <w:pStyle w:val="Heading1"/>
       </w:pPr>
       <w:r>
-        <w:t>Fresh Nebius evaluation method</w:t>
+        <w:t>Baseline Nebius evaluation method</w:t>
       </w:r>
     </w:p>
     <w:p>
@@ -4850,7 +4850,7 @@
     </w:p>
     <w:p>
       <w:r>
-        <w:t>The model receives the normal production context: aggregate references for investigation and consented affected values/rules for value assistance. Gold answers and source notes are withheld. Two source-coverage cases intentionally contain requirements that cannot be represented by the current rule schema, testing the system boundary rather than expecting the model to know an undisclosed policy.</w:t>
+        <w:t>The model receives the normal production context: aggregate references for investigation and consented affected values/rules for value assistance. Gold answers and source notes are withheld. Two source-coverage cases intentionally contain requirements that could not be represented by the baseline rule schema, testing the system boundary rather than expecting the model to know an undisclosed policy.</w:t>
       </w:r>
     </w:p>
     <w:p>
@@ -4873,7 +4873,7 @@
         <w:pStyle w:val="Heading1"/>
       </w:pPr>
       <w:r>
-        <w:t>Fresh Nebius results by cohort</w:t>
+        <w:t>Baseline Nebius results by cohort</w:t>
       </w:r>
     </w:p>
     <w:tbl>
@@ -6266,12 +6266,1959 @@
     </w:p>
     <w:p>
       <w:r>
-        <w:t>Practical follow-up: review the full source policy before treating a rules file as complete; extend the schema for conditional date ranges and email syntax; keep factual date confirmation in the human review step; and repeat the study with independently labeled cases before making broad reliability claims.</w:t>
+        <w:t>This baseline motivated the email and conditional date rules and conservative date handling described next. Source-to-rules review and independently labeled repeat evaluations remain necessary.</w:t>
       </w:r>
     </w:p>
     <w:p>
       <w:r>
-        <w:t>These small, deliberately constructed samples describe this run only. They do not establish a stable refusal rate, production accuracy or real-user completion time. The previous offline figures remain separate. Six new evaluator tests passed, including checks that missing responses are not mislabeled as refusals. No production validation behavior was changed by this study.</w:t>
+        <w:t>These small, deliberately constructed samples describe this run only. They do not establish a stable refusal rate, production accuracy or real-user completion time. The previous offline figures remain separate. Six new evaluator tests passed, including checks that missing responses are not mislabeled as refusals. The original baseline artifacts remain unchanged; the follow-up records production fixes separately.</w:t>
+      </w:r>
+    </w:p>
+    <w:p>
+      <w:r>
+        <w:br w:type="page"/>
+      </w:r>
+    </w:p>
+    <w:p>
+      <w:pPr>
+        <w:pStyle w:val="Heading1"/>
+      </w:pPr>
+      <w:r>
+        <w:t>Policy fixes and date clarification</w:t>
+      </w:r>
+    </w:p>
+    <w:p>
+      <w:r>
+        <w:t>The follow-up implements the two validation requirements missed in the baseline: email syntax and conditional date bounds. Impossible or ambiguous dates now require confirmation from a trusted source. A valid-looking nearest date is no longer offered as a correction.</w:t>
+      </w:r>
+    </w:p>
+    <w:tbl>
+      <w:tblPr>
+        <w:tblW w:type="auto" w:w="0"/>
+        <w:tblLayout w:type="fixed"/>
+        <w:tblLook w:firstColumn="1" w:firstRow="1" w:lastColumn="0" w:lastRow="0" w:noHBand="0" w:noVBand="1" w:val="04A0"/>
+      </w:tblPr>
+      <w:tblGrid>
+        <w:gridCol w:w="2376"/>
+        <w:gridCol w:w="7416"/>
+      </w:tblGrid>
+      <w:tr>
+        <w:trPr>
+          <w:cantSplit/>
+          <w:tblHeader/>
+        </w:trPr>
+        <w:tc>
+          <w:tcPr>
+            <w:tcW w:type="dxa" w:w="2376"/>
+            <w:vAlign w:val="center"/>
+            <w:shd w:fill="263A52"/>
+            <w:tcBorders>
+              <w:top w:val="single" w:sz="4" w:color="D9D9D9"/>
+              <w:left w:val="single" w:sz="4" w:color="D9D9D9"/>
+              <w:bottom w:val="single" w:sz="4" w:color="D9D9D9"/>
+              <w:right w:val="single" w:sz="4" w:color="D9D9D9"/>
+            </w:tcBorders>
+            <w:tcMar>
+              <w:top w:w="95" w:type="dxa"/>
+              <w:left w:w="95" w:type="dxa"/>
+              <w:bottom w:w="95" w:type="dxa"/>
+              <w:right w:w="95" w:type="dxa"/>
+            </w:tcMar>
+          </w:tcPr>
+          <w:p>
+            <w:pPr>
+              <w:spacing w:after="40" w:before="40" w:line="245" w:lineRule="auto"/>
+            </w:pPr>
+            <w:r>
+              <w:rPr>
+                <w:b/>
+                <w:color w:val="FFFFFF"/>
+                <w:sz w:val="20"/>
+              </w:rPr>
+              <w:t>Rule or safeguard</w:t>
+            </w:r>
+          </w:p>
+        </w:tc>
+        <w:tc>
+          <w:tcPr>
+            <w:tcW w:type="dxa" w:w="7416"/>
+            <w:vAlign w:val="center"/>
+            <w:shd w:fill="263A52"/>
+            <w:tcBorders>
+              <w:top w:val="single" w:sz="4" w:color="D9D9D9"/>
+              <w:left w:val="single" w:sz="4" w:color="D9D9D9"/>
+              <w:bottom w:val="single" w:sz="4" w:color="D9D9D9"/>
+              <w:right w:val="single" w:sz="4" w:color="D9D9D9"/>
+            </w:tcBorders>
+            <w:tcMar>
+              <w:top w:w="95" w:type="dxa"/>
+              <w:left w:w="95" w:type="dxa"/>
+              <w:bottom w:w="95" w:type="dxa"/>
+              <w:right w:w="95" w:type="dxa"/>
+            </w:tcMar>
+          </w:tcPr>
+          <w:p>
+            <w:pPr>
+              <w:spacing w:after="40" w:before="40" w:line="245" w:lineRule="auto"/>
+            </w:pPr>
+            <w:r>
+              <w:rPr>
+                <w:b/>
+                <w:color w:val="FFFFFF"/>
+                <w:sz w:val="20"/>
+              </w:rPr>
+              <w:t>Behavior and example</w:t>
+            </w:r>
+          </w:p>
+        </w:tc>
+      </w:tr>
+      <w:tr>
+        <w:trPr>
+          <w:cantSplit/>
+        </w:trPr>
+        <w:tc>
+          <w:tcPr>
+            <w:tcW w:type="dxa" w:w="2376"/>
+            <w:vAlign w:val="center"/>
+            <w:shd w:fill="FFFFFF"/>
+            <w:tcBorders>
+              <w:top w:val="single" w:sz="4" w:color="D9D9D9"/>
+              <w:left w:val="single" w:sz="4" w:color="D9D9D9"/>
+              <w:bottom w:val="single" w:sz="4" w:color="D9D9D9"/>
+              <w:right w:val="single" w:sz="4" w:color="D9D9D9"/>
+            </w:tcBorders>
+            <w:tcMar>
+              <w:top w:w="95" w:type="dxa"/>
+              <w:left w:w="95" w:type="dxa"/>
+              <w:bottom w:w="95" w:type="dxa"/>
+              <w:right w:w="95" w:type="dxa"/>
+            </w:tcMar>
+          </w:tcPr>
+          <w:p>
+            <w:pPr>
+              <w:spacing w:after="40" w:before="40" w:line="245" w:lineRule="auto"/>
+            </w:pPr>
+            <w:r>
+              <w:rPr>
+                <w:b w:val="0"/>
+                <w:color w:val="000000"/>
+                <w:sz w:val="20"/>
+              </w:rPr>
+              <w:t>email_columns</w:t>
+            </w:r>
+          </w:p>
+        </w:tc>
+        <w:tc>
+          <w:tcPr>
+            <w:tcW w:type="dxa" w:w="7416"/>
+            <w:vAlign w:val="center"/>
+            <w:shd w:fill="FFFFFF"/>
+            <w:tcBorders>
+              <w:top w:val="single" w:sz="4" w:color="D9D9D9"/>
+              <w:left w:val="single" w:sz="4" w:color="D9D9D9"/>
+              <w:bottom w:val="single" w:sz="4" w:color="D9D9D9"/>
+              <w:right w:val="single" w:sz="4" w:color="D9D9D9"/>
+            </w:tcBorders>
+            <w:tcMar>
+              <w:top w:w="95" w:type="dxa"/>
+              <w:left w:w="95" w:type="dxa"/>
+              <w:bottom w:w="95" w:type="dxa"/>
+              <w:right w:w="95" w:type="dxa"/>
+            </w:tcMar>
+          </w:tcPr>
+          <w:p>
+            <w:pPr>
+              <w:spacing w:after="40" w:before="40" w:line="245" w:lineRule="auto"/>
+            </w:pPr>
+            <w:r>
+              <w:rPr>
+                <w:b w:val="0"/>
+                <w:color w:val="000000"/>
+                <w:sz w:val="20"/>
+              </w:rPr>
+              <w:t>Opt-in ASCII mailbox syntax and dotted domain checks. not-an-email fails; o'neil+tag@sub.example.co.uk passes. Delivery and ownership are not checked. Quoted local parts and internationalized addresses are outside this contract.</w:t>
+            </w:r>
+          </w:p>
+        </w:tc>
+      </w:tr>
+      <w:tr>
+        <w:trPr>
+          <w:cantSplit/>
+        </w:trPr>
+        <w:tc>
+          <w:tcPr>
+            <w:tcW w:type="dxa" w:w="2376"/>
+            <w:vAlign w:val="center"/>
+            <w:shd w:fill="F2F5F8"/>
+            <w:tcBorders>
+              <w:top w:val="single" w:sz="4" w:color="D9D9D9"/>
+              <w:left w:val="single" w:sz="4" w:color="D9D9D9"/>
+              <w:bottom w:val="single" w:sz="4" w:color="D9D9D9"/>
+              <w:right w:val="single" w:sz="4" w:color="D9D9D9"/>
+            </w:tcBorders>
+            <w:tcMar>
+              <w:top w:w="95" w:type="dxa"/>
+              <w:left w:w="95" w:type="dxa"/>
+              <w:bottom w:w="95" w:type="dxa"/>
+              <w:right w:w="95" w:type="dxa"/>
+            </w:tcMar>
+          </w:tcPr>
+          <w:p>
+            <w:pPr>
+              <w:spacing w:after="40" w:before="40" w:line="245" w:lineRule="auto"/>
+            </w:pPr>
+            <w:r>
+              <w:rPr>
+                <w:b w:val="0"/>
+                <w:color w:val="000000"/>
+                <w:sz w:val="20"/>
+              </w:rPr>
+              <w:t>conditional_dates</w:t>
+            </w:r>
+          </w:p>
+        </w:tc>
+        <w:tc>
+          <w:tcPr>
+            <w:tcW w:type="dxa" w:w="7416"/>
+            <w:vAlign w:val="center"/>
+            <w:shd w:fill="F2F5F8"/>
+            <w:tcBorders>
+              <w:top w:val="single" w:sz="4" w:color="D9D9D9"/>
+              <w:left w:val="single" w:sz="4" w:color="D9D9D9"/>
+              <w:bottom w:val="single" w:sz="4" w:color="D9D9D9"/>
+              <w:right w:val="single" w:sz="4" w:color="D9D9D9"/>
+            </w:tcBorders>
+            <w:tcMar>
+              <w:top w:w="95" w:type="dxa"/>
+              <w:left w:w="95" w:type="dxa"/>
+              <w:bottom w:w="95" w:type="dxa"/>
+              <w:right w:w="95" w:type="dxa"/>
+            </w:tcMar>
+          </w:tcPr>
+          <w:p>
+            <w:pPr>
+              <w:spacing w:after="40" w:before="40" w:line="245" w:lineRule="auto"/>
+            </w:pPr>
+            <w:r>
+              <w:rPr>
+                <w:b w:val="0"/>
+                <w:color w:val="000000"/>
+                <w:sz w:val="20"/>
+              </w:rPr>
+              <w:t>An exact condition activates inclusive ISO bounds. Example: column signup_date, when_column country, equals GB, min_date 2027-01-01. max_date is optional. Target columns need date_formats entries.</w:t>
+            </w:r>
+          </w:p>
+        </w:tc>
+      </w:tr>
+      <w:tr>
+        <w:trPr>
+          <w:cantSplit/>
+        </w:trPr>
+        <w:tc>
+          <w:tcPr>
+            <w:tcW w:type="dxa" w:w="2376"/>
+            <w:vAlign w:val="center"/>
+            <w:shd w:fill="FFFFFF"/>
+            <w:tcBorders>
+              <w:top w:val="single" w:sz="4" w:color="D9D9D9"/>
+              <w:left w:val="single" w:sz="4" w:color="D9D9D9"/>
+              <w:bottom w:val="single" w:sz="4" w:color="D9D9D9"/>
+              <w:right w:val="single" w:sz="4" w:color="D9D9D9"/>
+            </w:tcBorders>
+            <w:tcMar>
+              <w:top w:w="95" w:type="dxa"/>
+              <w:left w:w="95" w:type="dxa"/>
+              <w:bottom w:w="95" w:type="dxa"/>
+              <w:right w:w="95" w:type="dxa"/>
+            </w:tcMar>
+          </w:tcPr>
+          <w:p>
+            <w:pPr>
+              <w:spacing w:after="40" w:before="40" w:line="245" w:lineRule="auto"/>
+            </w:pPr>
+            <w:r>
+              <w:rPr>
+                <w:b w:val="0"/>
+                <w:color w:val="000000"/>
+                <w:sz w:val="20"/>
+              </w:rPr>
+              <w:t>Date clarification</w:t>
+            </w:r>
+          </w:p>
+        </w:tc>
+        <w:tc>
+          <w:tcPr>
+            <w:tcW w:type="dxa" w:w="7416"/>
+            <w:vAlign w:val="center"/>
+            <w:shd w:fill="FFFFFF"/>
+            <w:tcBorders>
+              <w:top w:val="single" w:sz="4" w:color="D9D9D9"/>
+              <w:left w:val="single" w:sz="4" w:color="D9D9D9"/>
+              <w:bottom w:val="single" w:sz="4" w:color="D9D9D9"/>
+              <w:right w:val="single" w:sz="4" w:color="D9D9D9"/>
+            </w:tcBorders>
+            <w:tcMar>
+              <w:top w:w="95" w:type="dxa"/>
+              <w:left w:w="95" w:type="dxa"/>
+              <w:bottom w:w="95" w:type="dxa"/>
+              <w:right w:w="95" w:type="dxa"/>
+            </w:tcMar>
+          </w:tcPr>
+          <w:p>
+            <w:pPr>
+              <w:spacing w:after="40" w:before="40" w:line="245" w:lineRule="auto"/>
+            </w:pPr>
+            <w:r>
+              <w:rPr>
+                <w:b w:val="0"/>
+                <w:color w:val="000000"/>
+                <w:sz w:val="20"/>
+              </w:rPr>
+              <w:t>02/29/2027 is impossible. The agent asks for the intended date instead of choosing February 28. Valid 03/04/2028 with declared day-first input converts to 2028-04-03.</w:t>
+            </w:r>
+          </w:p>
+        </w:tc>
+      </w:tr>
+      <w:tr>
+        <w:trPr>
+          <w:cantSplit/>
+        </w:trPr>
+        <w:tc>
+          <w:tcPr>
+            <w:tcW w:type="dxa" w:w="2376"/>
+            <w:vAlign w:val="center"/>
+            <w:shd w:fill="F2F5F8"/>
+            <w:tcBorders>
+              <w:top w:val="single" w:sz="4" w:color="D9D9D9"/>
+              <w:left w:val="single" w:sz="4" w:color="D9D9D9"/>
+              <w:bottom w:val="single" w:sz="4" w:color="D9D9D9"/>
+              <w:right w:val="single" w:sz="4" w:color="D9D9D9"/>
+            </w:tcBorders>
+            <w:tcMar>
+              <w:top w:w="95" w:type="dxa"/>
+              <w:left w:w="95" w:type="dxa"/>
+              <w:bottom w:w="95" w:type="dxa"/>
+              <w:right w:w="95" w:type="dxa"/>
+            </w:tcMar>
+          </w:tcPr>
+          <w:p>
+            <w:pPr>
+              <w:spacing w:after="40" w:before="40" w:line="245" w:lineRule="auto"/>
+            </w:pPr>
+            <w:r>
+              <w:rPr>
+                <w:b w:val="0"/>
+                <w:color w:val="000000"/>
+                <w:sz w:val="20"/>
+              </w:rPr>
+              <w:t>Local enforcement</w:t>
+            </w:r>
+          </w:p>
+        </w:tc>
+        <w:tc>
+          <w:tcPr>
+            <w:tcW w:type="dxa" w:w="7416"/>
+            <w:vAlign w:val="center"/>
+            <w:shd w:fill="F2F5F8"/>
+            <w:tcBorders>
+              <w:top w:val="single" w:sz="4" w:color="D9D9D9"/>
+              <w:left w:val="single" w:sz="4" w:color="D9D9D9"/>
+              <w:bottom w:val="single" w:sz="4" w:color="D9D9D9"/>
+              <w:right w:val="single" w:sz="4" w:color="D9D9D9"/>
+            </w:tcBorders>
+            <w:tcMar>
+              <w:top w:w="95" w:type="dxa"/>
+              <w:left w:w="95" w:type="dxa"/>
+              <w:bottom w:w="95" w:type="dxa"/>
+              <w:right w:w="95" w:type="dxa"/>
+            </w:tcMar>
+          </w:tcPr>
+          <w:p>
+            <w:pPr>
+              <w:spacing w:after="40" w:before="40" w:line="245" w:lineRule="auto"/>
+            </w:pPr>
+            <w:r>
+              <w:rPr>
+                <w:b w:val="0"/>
+                <w:color w:val="000000"/>
+                <w:sz w:val="20"/>
+              </w:rPr>
+              <w:t>Even if the model guesses a date or malformed-email replacement, the local guard withholds it without rule-backed evidence. A true date outside policy bounds is not shifted merely to qualify.</w:t>
+            </w:r>
+          </w:p>
+        </w:tc>
+      </w:tr>
+    </w:tbl>
+    <w:p>
+      <w:pPr>
+        <w:spacing w:after="20"/>
+      </w:pPr>
+    </w:p>
+    <w:p>
+      <w:r>
+        <w:t>Try samples/customers_policy_review.csv with samples/import_rules_policy.json. Expect three blockers: record 1 has invalid email syntax and an out-of-policy GB date; record 2 has an impossible date. Record 3 is exactly on the accepted boundary. Confirm source facts before editing and retain both approval gates.</w:t>
+      </w:r>
+    </w:p>
+    <w:p>
+      <w:r>
+        <w:t>Existing jobs retain their saved rules, including when reset. Create a new job with the updated rules to enforce new policies. An unencoded policy is still invisible to the validator; this update does not claim automatic understanding of undisclosed business requirements.</w:t>
+      </w:r>
+    </w:p>
+    <w:p>
+      <w:pPr>
+        <w:pStyle w:val="Heading1"/>
+      </w:pPr>
+      <w:r>
+        <w:t>Comparison design</w:t>
+      </w:r>
+    </w:p>
+    <w:p>
+      <w:r>
+        <w:t>The live rerun uses the original 14 cases as regressions, explicitly encoding the two previously omitted requirements. Four new pre-labeled cases test multiple email errors, inclusive date boundaries and a nonmatching control, an impossible April date, and valid day-first conversion. New cases remain a separate cohort. The baseline date oracle now requires abstention; oracle-only source facts remain hidden from the model.</w:t>
+      </w:r>
+    </w:p>
+    <w:p>
+      <w:r>
+        <w:br w:type="page"/>
+      </w:r>
+    </w:p>
+    <w:p>
+      <w:pPr>
+        <w:pStyle w:val="Heading1"/>
+      </w:pPr>
+      <w:r>
+        <w:t>Nebius results after the fixes</w:t>
+      </w:r>
+    </w:p>
+    <w:p>
+      <w:r>
+        <w:t>Fresh provider calls used Qwen/Qwen3.5-397B-A17B at temperature 0 against commit b44cc75. The frozen baseline and its targeted retry remain separately published. This is one follow-up pass, not an independently reviewed benchmark.</w:t>
+      </w:r>
+    </w:p>
+    <w:tbl>
+      <w:tblPr>
+        <w:tblW w:type="auto" w:w="0"/>
+        <w:tblLayout w:type="fixed"/>
+        <w:tblLook w:firstColumn="1" w:firstRow="1" w:lastColumn="0" w:lastRow="0" w:noHBand="0" w:noVBand="1" w:val="04A0"/>
+      </w:tblPr>
+      <w:tblGrid>
+        <w:gridCol w:w="3600"/>
+        <w:gridCol w:w="936"/>
+        <w:gridCol w:w="2808"/>
+        <w:gridCol w:w="2448"/>
+      </w:tblGrid>
+      <w:tr>
+        <w:trPr>
+          <w:cantSplit/>
+          <w:tblHeader/>
+        </w:trPr>
+        <w:tc>
+          <w:tcPr>
+            <w:tcW w:type="dxa" w:w="3600"/>
+            <w:vAlign w:val="center"/>
+            <w:shd w:fill="263A52"/>
+            <w:tcBorders>
+              <w:top w:val="single" w:sz="4" w:color="D9D9D9"/>
+              <w:left w:val="single" w:sz="4" w:color="D9D9D9"/>
+              <w:bottom w:val="single" w:sz="4" w:color="D9D9D9"/>
+              <w:right w:val="single" w:sz="4" w:color="D9D9D9"/>
+            </w:tcBorders>
+            <w:tcMar>
+              <w:top w:w="95" w:type="dxa"/>
+              <w:left w:w="95" w:type="dxa"/>
+              <w:bottom w:w="95" w:type="dxa"/>
+              <w:right w:w="95" w:type="dxa"/>
+            </w:tcMar>
+          </w:tcPr>
+          <w:p>
+            <w:pPr>
+              <w:spacing w:after="40" w:before="40" w:line="245" w:lineRule="auto"/>
+            </w:pPr>
+            <w:r>
+              <w:rPr>
+                <w:b/>
+                <w:color w:val="FFFFFF"/>
+                <w:sz w:val="20"/>
+              </w:rPr>
+              <w:t>Cohort</w:t>
+            </w:r>
+          </w:p>
+        </w:tc>
+        <w:tc>
+          <w:tcPr>
+            <w:tcW w:type="dxa" w:w="936"/>
+            <w:vAlign w:val="center"/>
+            <w:shd w:fill="263A52"/>
+            <w:tcBorders>
+              <w:top w:val="single" w:sz="4" w:color="D9D9D9"/>
+              <w:left w:val="single" w:sz="4" w:color="D9D9D9"/>
+              <w:bottom w:val="single" w:sz="4" w:color="D9D9D9"/>
+              <w:right w:val="single" w:sz="4" w:color="D9D9D9"/>
+            </w:tcBorders>
+            <w:tcMar>
+              <w:top w:w="95" w:type="dxa"/>
+              <w:left w:w="95" w:type="dxa"/>
+              <w:bottom w:w="95" w:type="dxa"/>
+              <w:right w:w="95" w:type="dxa"/>
+            </w:tcMar>
+          </w:tcPr>
+          <w:p>
+            <w:pPr>
+              <w:spacing w:after="40" w:before="40" w:line="245" w:lineRule="auto"/>
+            </w:pPr>
+            <w:r>
+              <w:rPr>
+                <w:b/>
+                <w:color w:val="FFFFFF"/>
+                <w:sz w:val="20"/>
+              </w:rPr>
+              <w:t>Cases</w:t>
+            </w:r>
+          </w:p>
+        </w:tc>
+        <w:tc>
+          <w:tcPr>
+            <w:tcW w:type="dxa" w:w="2808"/>
+            <w:vAlign w:val="center"/>
+            <w:shd w:fill="263A52"/>
+            <w:tcBorders>
+              <w:top w:val="single" w:sz="4" w:color="D9D9D9"/>
+              <w:left w:val="single" w:sz="4" w:color="D9D9D9"/>
+              <w:bottom w:val="single" w:sz="4" w:color="D9D9D9"/>
+              <w:right w:val="single" w:sz="4" w:color="D9D9D9"/>
+            </w:tcBorders>
+            <w:tcMar>
+              <w:top w:w="95" w:type="dxa"/>
+              <w:left w:w="95" w:type="dxa"/>
+              <w:bottom w:w="95" w:type="dxa"/>
+              <w:right w:w="95" w:type="dxa"/>
+            </w:tcMar>
+          </w:tcPr>
+          <w:p>
+            <w:pPr>
+              <w:spacing w:after="40" w:before="40" w:line="245" w:lineRule="auto"/>
+            </w:pPr>
+            <w:r>
+              <w:rPr>
+                <w:b/>
+                <w:color w:val="FFFFFF"/>
+                <w:sz w:val="20"/>
+              </w:rPr>
+              <w:t>Missed / expected</w:t>
+            </w:r>
+          </w:p>
+        </w:tc>
+        <w:tc>
+          <w:tcPr>
+            <w:tcW w:type="dxa" w:w="2448"/>
+            <w:vAlign w:val="center"/>
+            <w:shd w:fill="263A52"/>
+            <w:tcBorders>
+              <w:top w:val="single" w:sz="4" w:color="D9D9D9"/>
+              <w:left w:val="single" w:sz="4" w:color="D9D9D9"/>
+              <w:bottom w:val="single" w:sz="4" w:color="D9D9D9"/>
+              <w:right w:val="single" w:sz="4" w:color="D9D9D9"/>
+            </w:tcBorders>
+            <w:tcMar>
+              <w:top w:w="95" w:type="dxa"/>
+              <w:left w:w="95" w:type="dxa"/>
+              <w:bottom w:w="95" w:type="dxa"/>
+              <w:right w:w="95" w:type="dxa"/>
+            </w:tcMar>
+          </w:tcPr>
+          <w:p>
+            <w:pPr>
+              <w:spacing w:after="40" w:before="40" w:line="245" w:lineRule="auto"/>
+            </w:pPr>
+            <w:r>
+              <w:rPr>
+                <w:b/>
+                <w:color w:val="FFFFFF"/>
+                <w:sz w:val="20"/>
+              </w:rPr>
+              <w:t>False alarms</w:t>
+            </w:r>
+          </w:p>
+        </w:tc>
+      </w:tr>
+      <w:tr>
+        <w:trPr>
+          <w:cantSplit/>
+        </w:trPr>
+        <w:tc>
+          <w:tcPr>
+            <w:tcW w:type="dxa" w:w="3600"/>
+            <w:vAlign w:val="center"/>
+            <w:shd w:fill="FFFFFF"/>
+            <w:tcBorders>
+              <w:top w:val="single" w:sz="4" w:color="D9D9D9"/>
+              <w:left w:val="single" w:sz="4" w:color="D9D9D9"/>
+              <w:bottom w:val="single" w:sz="4" w:color="D9D9D9"/>
+              <w:right w:val="single" w:sz="4" w:color="D9D9D9"/>
+            </w:tcBorders>
+            <w:tcMar>
+              <w:top w:w="95" w:type="dxa"/>
+              <w:left w:w="95" w:type="dxa"/>
+              <w:bottom w:w="95" w:type="dxa"/>
+              <w:right w:w="95" w:type="dxa"/>
+            </w:tcMar>
+          </w:tcPr>
+          <w:p>
+            <w:pPr>
+              <w:spacing w:after="40" w:before="40" w:line="245" w:lineRule="auto"/>
+            </w:pPr>
+            <w:r>
+              <w:rPr>
+                <w:b w:val="0"/>
+                <w:color w:val="000000"/>
+                <w:sz w:val="20"/>
+              </w:rPr>
+              <w:t>Declared rules</w:t>
+            </w:r>
+          </w:p>
+        </w:tc>
+        <w:tc>
+          <w:tcPr>
+            <w:tcW w:type="dxa" w:w="936"/>
+            <w:vAlign w:val="center"/>
+            <w:shd w:fill="FFFFFF"/>
+            <w:tcBorders>
+              <w:top w:val="single" w:sz="4" w:color="D9D9D9"/>
+              <w:left w:val="single" w:sz="4" w:color="D9D9D9"/>
+              <w:bottom w:val="single" w:sz="4" w:color="D9D9D9"/>
+              <w:right w:val="single" w:sz="4" w:color="D9D9D9"/>
+            </w:tcBorders>
+            <w:tcMar>
+              <w:top w:w="95" w:type="dxa"/>
+              <w:left w:w="95" w:type="dxa"/>
+              <w:bottom w:w="95" w:type="dxa"/>
+              <w:right w:w="95" w:type="dxa"/>
+            </w:tcMar>
+          </w:tcPr>
+          <w:p>
+            <w:pPr>
+              <w:spacing w:after="40" w:before="40" w:line="245" w:lineRule="auto"/>
+            </w:pPr>
+            <w:r>
+              <w:rPr>
+                <w:b w:val="0"/>
+                <w:color w:val="000000"/>
+                <w:sz w:val="20"/>
+              </w:rPr>
+              <w:t>4</w:t>
+            </w:r>
+          </w:p>
+        </w:tc>
+        <w:tc>
+          <w:tcPr>
+            <w:tcW w:type="dxa" w:w="2808"/>
+            <w:vAlign w:val="center"/>
+            <w:shd w:fill="FFFFFF"/>
+            <w:tcBorders>
+              <w:top w:val="single" w:sz="4" w:color="D9D9D9"/>
+              <w:left w:val="single" w:sz="4" w:color="D9D9D9"/>
+              <w:bottom w:val="single" w:sz="4" w:color="D9D9D9"/>
+              <w:right w:val="single" w:sz="4" w:color="D9D9D9"/>
+            </w:tcBorders>
+            <w:tcMar>
+              <w:top w:w="95" w:type="dxa"/>
+              <w:left w:w="95" w:type="dxa"/>
+              <w:bottom w:w="95" w:type="dxa"/>
+              <w:right w:w="95" w:type="dxa"/>
+            </w:tcMar>
+          </w:tcPr>
+          <w:p>
+            <w:pPr>
+              <w:spacing w:after="40" w:before="40" w:line="245" w:lineRule="auto"/>
+            </w:pPr>
+            <w:r>
+              <w:rPr>
+                <w:b w:val="0"/>
+                <w:color w:val="000000"/>
+                <w:sz w:val="20"/>
+              </w:rPr>
+              <w:t>0 / 7</w:t>
+            </w:r>
+          </w:p>
+        </w:tc>
+        <w:tc>
+          <w:tcPr>
+            <w:tcW w:type="dxa" w:w="2448"/>
+            <w:vAlign w:val="center"/>
+            <w:shd w:fill="FFFFFF"/>
+            <w:tcBorders>
+              <w:top w:val="single" w:sz="4" w:color="D9D9D9"/>
+              <w:left w:val="single" w:sz="4" w:color="D9D9D9"/>
+              <w:bottom w:val="single" w:sz="4" w:color="D9D9D9"/>
+              <w:right w:val="single" w:sz="4" w:color="D9D9D9"/>
+            </w:tcBorders>
+            <w:tcMar>
+              <w:top w:w="95" w:type="dxa"/>
+              <w:left w:w="95" w:type="dxa"/>
+              <w:bottom w:w="95" w:type="dxa"/>
+              <w:right w:w="95" w:type="dxa"/>
+            </w:tcMar>
+          </w:tcPr>
+          <w:p>
+            <w:pPr>
+              <w:spacing w:after="40" w:before="40" w:line="245" w:lineRule="auto"/>
+            </w:pPr>
+            <w:r>
+              <w:rPr>
+                <w:b w:val="0"/>
+                <w:color w:val="000000"/>
+                <w:sz w:val="20"/>
+              </w:rPr>
+              <w:t>0</w:t>
+            </w:r>
+          </w:p>
+        </w:tc>
+      </w:tr>
+      <w:tr>
+        <w:trPr>
+          <w:cantSplit/>
+        </w:trPr>
+        <w:tc>
+          <w:tcPr>
+            <w:tcW w:type="dxa" w:w="3600"/>
+            <w:vAlign w:val="center"/>
+            <w:shd w:fill="F2F5F8"/>
+            <w:tcBorders>
+              <w:top w:val="single" w:sz="4" w:color="D9D9D9"/>
+              <w:left w:val="single" w:sz="4" w:color="D9D9D9"/>
+              <w:bottom w:val="single" w:sz="4" w:color="D9D9D9"/>
+              <w:right w:val="single" w:sz="4" w:color="D9D9D9"/>
+            </w:tcBorders>
+            <w:tcMar>
+              <w:top w:w="95" w:type="dxa"/>
+              <w:left w:w="95" w:type="dxa"/>
+              <w:bottom w:w="95" w:type="dxa"/>
+              <w:right w:w="95" w:type="dxa"/>
+            </w:tcMar>
+          </w:tcPr>
+          <w:p>
+            <w:pPr>
+              <w:spacing w:after="40" w:before="40" w:line="245" w:lineRule="auto"/>
+            </w:pPr>
+            <w:r>
+              <w:rPr>
+                <w:b w:val="0"/>
+                <w:color w:val="000000"/>
+                <w:sz w:val="20"/>
+              </w:rPr>
+              <w:t>Semantic repairs</w:t>
+            </w:r>
+          </w:p>
+        </w:tc>
+        <w:tc>
+          <w:tcPr>
+            <w:tcW w:type="dxa" w:w="936"/>
+            <w:vAlign w:val="center"/>
+            <w:shd w:fill="F2F5F8"/>
+            <w:tcBorders>
+              <w:top w:val="single" w:sz="4" w:color="D9D9D9"/>
+              <w:left w:val="single" w:sz="4" w:color="D9D9D9"/>
+              <w:bottom w:val="single" w:sz="4" w:color="D9D9D9"/>
+              <w:right w:val="single" w:sz="4" w:color="D9D9D9"/>
+            </w:tcBorders>
+            <w:tcMar>
+              <w:top w:w="95" w:type="dxa"/>
+              <w:left w:w="95" w:type="dxa"/>
+              <w:bottom w:w="95" w:type="dxa"/>
+              <w:right w:w="95" w:type="dxa"/>
+            </w:tcMar>
+          </w:tcPr>
+          <w:p>
+            <w:pPr>
+              <w:spacing w:after="40" w:before="40" w:line="245" w:lineRule="auto"/>
+            </w:pPr>
+            <w:r>
+              <w:rPr>
+                <w:b w:val="0"/>
+                <w:color w:val="000000"/>
+                <w:sz w:val="20"/>
+              </w:rPr>
+              <w:t>4</w:t>
+            </w:r>
+          </w:p>
+        </w:tc>
+        <w:tc>
+          <w:tcPr>
+            <w:tcW w:type="dxa" w:w="2808"/>
+            <w:vAlign w:val="center"/>
+            <w:shd w:fill="F2F5F8"/>
+            <w:tcBorders>
+              <w:top w:val="single" w:sz="4" w:color="D9D9D9"/>
+              <w:left w:val="single" w:sz="4" w:color="D9D9D9"/>
+              <w:bottom w:val="single" w:sz="4" w:color="D9D9D9"/>
+              <w:right w:val="single" w:sz="4" w:color="D9D9D9"/>
+            </w:tcBorders>
+            <w:tcMar>
+              <w:top w:w="95" w:type="dxa"/>
+              <w:left w:w="95" w:type="dxa"/>
+              <w:bottom w:w="95" w:type="dxa"/>
+              <w:right w:w="95" w:type="dxa"/>
+            </w:tcMar>
+          </w:tcPr>
+          <w:p>
+            <w:pPr>
+              <w:spacing w:after="40" w:before="40" w:line="245" w:lineRule="auto"/>
+            </w:pPr>
+            <w:r>
+              <w:rPr>
+                <w:b w:val="0"/>
+                <w:color w:val="000000"/>
+                <w:sz w:val="20"/>
+              </w:rPr>
+              <w:t>0 / 7</w:t>
+            </w:r>
+          </w:p>
+        </w:tc>
+        <w:tc>
+          <w:tcPr>
+            <w:tcW w:type="dxa" w:w="2448"/>
+            <w:vAlign w:val="center"/>
+            <w:shd w:fill="F2F5F8"/>
+            <w:tcBorders>
+              <w:top w:val="single" w:sz="4" w:color="D9D9D9"/>
+              <w:left w:val="single" w:sz="4" w:color="D9D9D9"/>
+              <w:bottom w:val="single" w:sz="4" w:color="D9D9D9"/>
+              <w:right w:val="single" w:sz="4" w:color="D9D9D9"/>
+            </w:tcBorders>
+            <w:tcMar>
+              <w:top w:w="95" w:type="dxa"/>
+              <w:left w:w="95" w:type="dxa"/>
+              <w:bottom w:w="95" w:type="dxa"/>
+              <w:right w:w="95" w:type="dxa"/>
+            </w:tcMar>
+          </w:tcPr>
+          <w:p>
+            <w:pPr>
+              <w:spacing w:after="40" w:before="40" w:line="245" w:lineRule="auto"/>
+            </w:pPr>
+            <w:r>
+              <w:rPr>
+                <w:b w:val="0"/>
+                <w:color w:val="000000"/>
+                <w:sz w:val="20"/>
+              </w:rPr>
+              <w:t>0</w:t>
+            </w:r>
+          </w:p>
+        </w:tc>
+      </w:tr>
+      <w:tr>
+        <w:trPr>
+          <w:cantSplit/>
+        </w:trPr>
+        <w:tc>
+          <w:tcPr>
+            <w:tcW w:type="dxa" w:w="3600"/>
+            <w:vAlign w:val="center"/>
+            <w:shd w:fill="FFFFFF"/>
+            <w:tcBorders>
+              <w:top w:val="single" w:sz="4" w:color="D9D9D9"/>
+              <w:left w:val="single" w:sz="4" w:color="D9D9D9"/>
+              <w:bottom w:val="single" w:sz="4" w:color="D9D9D9"/>
+              <w:right w:val="single" w:sz="4" w:color="D9D9D9"/>
+            </w:tcBorders>
+            <w:tcMar>
+              <w:top w:w="95" w:type="dxa"/>
+              <w:left w:w="95" w:type="dxa"/>
+              <w:bottom w:w="95" w:type="dxa"/>
+              <w:right w:w="95" w:type="dxa"/>
+            </w:tcMar>
+          </w:tcPr>
+          <w:p>
+            <w:pPr>
+              <w:spacing w:after="40" w:before="40" w:line="245" w:lineRule="auto"/>
+            </w:pPr>
+            <w:r>
+              <w:rPr>
+                <w:b w:val="0"/>
+                <w:color w:val="000000"/>
+                <w:sz w:val="20"/>
+              </w:rPr>
+              <w:t>Exceptions and knowledge</w:t>
+            </w:r>
+          </w:p>
+        </w:tc>
+        <w:tc>
+          <w:tcPr>
+            <w:tcW w:type="dxa" w:w="936"/>
+            <w:vAlign w:val="center"/>
+            <w:shd w:fill="FFFFFF"/>
+            <w:tcBorders>
+              <w:top w:val="single" w:sz="4" w:color="D9D9D9"/>
+              <w:left w:val="single" w:sz="4" w:color="D9D9D9"/>
+              <w:bottom w:val="single" w:sz="4" w:color="D9D9D9"/>
+              <w:right w:val="single" w:sz="4" w:color="D9D9D9"/>
+            </w:tcBorders>
+            <w:tcMar>
+              <w:top w:w="95" w:type="dxa"/>
+              <w:left w:w="95" w:type="dxa"/>
+              <w:bottom w:w="95" w:type="dxa"/>
+              <w:right w:w="95" w:type="dxa"/>
+            </w:tcMar>
+          </w:tcPr>
+          <w:p>
+            <w:pPr>
+              <w:spacing w:after="40" w:before="40" w:line="245" w:lineRule="auto"/>
+            </w:pPr>
+            <w:r>
+              <w:rPr>
+                <w:b w:val="0"/>
+                <w:color w:val="000000"/>
+                <w:sz w:val="20"/>
+              </w:rPr>
+              <w:t>4</w:t>
+            </w:r>
+          </w:p>
+        </w:tc>
+        <w:tc>
+          <w:tcPr>
+            <w:tcW w:type="dxa" w:w="2808"/>
+            <w:vAlign w:val="center"/>
+            <w:shd w:fill="FFFFFF"/>
+            <w:tcBorders>
+              <w:top w:val="single" w:sz="4" w:color="D9D9D9"/>
+              <w:left w:val="single" w:sz="4" w:color="D9D9D9"/>
+              <w:bottom w:val="single" w:sz="4" w:color="D9D9D9"/>
+              <w:right w:val="single" w:sz="4" w:color="D9D9D9"/>
+            </w:tcBorders>
+            <w:tcMar>
+              <w:top w:w="95" w:type="dxa"/>
+              <w:left w:w="95" w:type="dxa"/>
+              <w:bottom w:w="95" w:type="dxa"/>
+              <w:right w:w="95" w:type="dxa"/>
+            </w:tcMar>
+          </w:tcPr>
+          <w:p>
+            <w:pPr>
+              <w:spacing w:after="40" w:before="40" w:line="245" w:lineRule="auto"/>
+            </w:pPr>
+            <w:r>
+              <w:rPr>
+                <w:b w:val="0"/>
+                <w:color w:val="000000"/>
+                <w:sz w:val="20"/>
+              </w:rPr>
+              <w:t>0 / 7</w:t>
+            </w:r>
+          </w:p>
+        </w:tc>
+        <w:tc>
+          <w:tcPr>
+            <w:tcW w:type="dxa" w:w="2448"/>
+            <w:vAlign w:val="center"/>
+            <w:shd w:fill="FFFFFF"/>
+            <w:tcBorders>
+              <w:top w:val="single" w:sz="4" w:color="D9D9D9"/>
+              <w:left w:val="single" w:sz="4" w:color="D9D9D9"/>
+              <w:bottom w:val="single" w:sz="4" w:color="D9D9D9"/>
+              <w:right w:val="single" w:sz="4" w:color="D9D9D9"/>
+            </w:tcBorders>
+            <w:tcMar>
+              <w:top w:w="95" w:type="dxa"/>
+              <w:left w:w="95" w:type="dxa"/>
+              <w:bottom w:w="95" w:type="dxa"/>
+              <w:right w:w="95" w:type="dxa"/>
+            </w:tcMar>
+          </w:tcPr>
+          <w:p>
+            <w:pPr>
+              <w:spacing w:after="40" w:before="40" w:line="245" w:lineRule="auto"/>
+            </w:pPr>
+            <w:r>
+              <w:rPr>
+                <w:b w:val="0"/>
+                <w:color w:val="000000"/>
+                <w:sz w:val="20"/>
+              </w:rPr>
+              <w:t>0</w:t>
+            </w:r>
+          </w:p>
+        </w:tc>
+      </w:tr>
+      <w:tr>
+        <w:trPr>
+          <w:cantSplit/>
+        </w:trPr>
+        <w:tc>
+          <w:tcPr>
+            <w:tcW w:type="dxa" w:w="3600"/>
+            <w:vAlign w:val="center"/>
+            <w:shd w:fill="F2F5F8"/>
+            <w:tcBorders>
+              <w:top w:val="single" w:sz="4" w:color="D9D9D9"/>
+              <w:left w:val="single" w:sz="4" w:color="D9D9D9"/>
+              <w:bottom w:val="single" w:sz="4" w:color="D9D9D9"/>
+              <w:right w:val="single" w:sz="4" w:color="D9D9D9"/>
+            </w:tcBorders>
+            <w:tcMar>
+              <w:top w:w="95" w:type="dxa"/>
+              <w:left w:w="95" w:type="dxa"/>
+              <w:bottom w:w="95" w:type="dxa"/>
+              <w:right w:w="95" w:type="dxa"/>
+            </w:tcMar>
+          </w:tcPr>
+          <w:p>
+            <w:pPr>
+              <w:spacing w:after="40" w:before="40" w:line="245" w:lineRule="auto"/>
+            </w:pPr>
+            <w:r>
+              <w:rPr>
+                <w:b w:val="0"/>
+                <w:color w:val="000000"/>
+                <w:sz w:val="20"/>
+              </w:rPr>
+              <w:t>Encoded source policies</w:t>
+            </w:r>
+          </w:p>
+        </w:tc>
+        <w:tc>
+          <w:tcPr>
+            <w:tcW w:type="dxa" w:w="936"/>
+            <w:vAlign w:val="center"/>
+            <w:shd w:fill="F2F5F8"/>
+            <w:tcBorders>
+              <w:top w:val="single" w:sz="4" w:color="D9D9D9"/>
+              <w:left w:val="single" w:sz="4" w:color="D9D9D9"/>
+              <w:bottom w:val="single" w:sz="4" w:color="D9D9D9"/>
+              <w:right w:val="single" w:sz="4" w:color="D9D9D9"/>
+            </w:tcBorders>
+            <w:tcMar>
+              <w:top w:w="95" w:type="dxa"/>
+              <w:left w:w="95" w:type="dxa"/>
+              <w:bottom w:w="95" w:type="dxa"/>
+              <w:right w:w="95" w:type="dxa"/>
+            </w:tcMar>
+          </w:tcPr>
+          <w:p>
+            <w:pPr>
+              <w:spacing w:after="40" w:before="40" w:line="245" w:lineRule="auto"/>
+            </w:pPr>
+            <w:r>
+              <w:rPr>
+                <w:b w:val="0"/>
+                <w:color w:val="000000"/>
+                <w:sz w:val="20"/>
+              </w:rPr>
+              <w:t>2</w:t>
+            </w:r>
+          </w:p>
+        </w:tc>
+        <w:tc>
+          <w:tcPr>
+            <w:tcW w:type="dxa" w:w="2808"/>
+            <w:vAlign w:val="center"/>
+            <w:shd w:fill="F2F5F8"/>
+            <w:tcBorders>
+              <w:top w:val="single" w:sz="4" w:color="D9D9D9"/>
+              <w:left w:val="single" w:sz="4" w:color="D9D9D9"/>
+              <w:bottom w:val="single" w:sz="4" w:color="D9D9D9"/>
+              <w:right w:val="single" w:sz="4" w:color="D9D9D9"/>
+            </w:tcBorders>
+            <w:tcMar>
+              <w:top w:w="95" w:type="dxa"/>
+              <w:left w:w="95" w:type="dxa"/>
+              <w:bottom w:w="95" w:type="dxa"/>
+              <w:right w:w="95" w:type="dxa"/>
+            </w:tcMar>
+          </w:tcPr>
+          <w:p>
+            <w:pPr>
+              <w:spacing w:after="40" w:before="40" w:line="245" w:lineRule="auto"/>
+            </w:pPr>
+            <w:r>
+              <w:rPr>
+                <w:b w:val="0"/>
+                <w:color w:val="000000"/>
+                <w:sz w:val="20"/>
+              </w:rPr>
+              <w:t>0 / 2</w:t>
+            </w:r>
+          </w:p>
+        </w:tc>
+        <w:tc>
+          <w:tcPr>
+            <w:tcW w:type="dxa" w:w="2448"/>
+            <w:vAlign w:val="center"/>
+            <w:shd w:fill="F2F5F8"/>
+            <w:tcBorders>
+              <w:top w:val="single" w:sz="4" w:color="D9D9D9"/>
+              <w:left w:val="single" w:sz="4" w:color="D9D9D9"/>
+              <w:bottom w:val="single" w:sz="4" w:color="D9D9D9"/>
+              <w:right w:val="single" w:sz="4" w:color="D9D9D9"/>
+            </w:tcBorders>
+            <w:tcMar>
+              <w:top w:w="95" w:type="dxa"/>
+              <w:left w:w="95" w:type="dxa"/>
+              <w:bottom w:w="95" w:type="dxa"/>
+              <w:right w:w="95" w:type="dxa"/>
+            </w:tcMar>
+          </w:tcPr>
+          <w:p>
+            <w:pPr>
+              <w:spacing w:after="40" w:before="40" w:line="245" w:lineRule="auto"/>
+            </w:pPr>
+            <w:r>
+              <w:rPr>
+                <w:b w:val="0"/>
+                <w:color w:val="000000"/>
+                <w:sz w:val="20"/>
+              </w:rPr>
+              <w:t>0</w:t>
+            </w:r>
+          </w:p>
+        </w:tc>
+      </w:tr>
+      <w:tr>
+        <w:trPr>
+          <w:cantSplit/>
+        </w:trPr>
+        <w:tc>
+          <w:tcPr>
+            <w:tcW w:type="dxa" w:w="3600"/>
+            <w:vAlign w:val="center"/>
+            <w:shd w:fill="FFFFFF"/>
+            <w:tcBorders>
+              <w:top w:val="single" w:sz="4" w:color="D9D9D9"/>
+              <w:left w:val="single" w:sz="4" w:color="D9D9D9"/>
+              <w:bottom w:val="single" w:sz="4" w:color="D9D9D9"/>
+              <w:right w:val="single" w:sz="4" w:color="D9D9D9"/>
+            </w:tcBorders>
+            <w:tcMar>
+              <w:top w:w="95" w:type="dxa"/>
+              <w:left w:w="95" w:type="dxa"/>
+              <w:bottom w:w="95" w:type="dxa"/>
+              <w:right w:w="95" w:type="dxa"/>
+            </w:tcMar>
+          </w:tcPr>
+          <w:p>
+            <w:pPr>
+              <w:spacing w:after="40" w:before="40" w:line="245" w:lineRule="auto"/>
+            </w:pPr>
+            <w:r>
+              <w:rPr>
+                <w:b w:val="0"/>
+                <w:color w:val="000000"/>
+                <w:sz w:val="20"/>
+              </w:rPr>
+              <w:t>New holdout cases</w:t>
+            </w:r>
+          </w:p>
+        </w:tc>
+        <w:tc>
+          <w:tcPr>
+            <w:tcW w:type="dxa" w:w="936"/>
+            <w:vAlign w:val="center"/>
+            <w:shd w:fill="FFFFFF"/>
+            <w:tcBorders>
+              <w:top w:val="single" w:sz="4" w:color="D9D9D9"/>
+              <w:left w:val="single" w:sz="4" w:color="D9D9D9"/>
+              <w:bottom w:val="single" w:sz="4" w:color="D9D9D9"/>
+              <w:right w:val="single" w:sz="4" w:color="D9D9D9"/>
+            </w:tcBorders>
+            <w:tcMar>
+              <w:top w:w="95" w:type="dxa"/>
+              <w:left w:w="95" w:type="dxa"/>
+              <w:bottom w:w="95" w:type="dxa"/>
+              <w:right w:w="95" w:type="dxa"/>
+            </w:tcMar>
+          </w:tcPr>
+          <w:p>
+            <w:pPr>
+              <w:spacing w:after="40" w:before="40" w:line="245" w:lineRule="auto"/>
+            </w:pPr>
+            <w:r>
+              <w:rPr>
+                <w:b w:val="0"/>
+                <w:color w:val="000000"/>
+                <w:sz w:val="20"/>
+              </w:rPr>
+              <w:t>4</w:t>
+            </w:r>
+          </w:p>
+        </w:tc>
+        <w:tc>
+          <w:tcPr>
+            <w:tcW w:type="dxa" w:w="2808"/>
+            <w:vAlign w:val="center"/>
+            <w:shd w:fill="FFFFFF"/>
+            <w:tcBorders>
+              <w:top w:val="single" w:sz="4" w:color="D9D9D9"/>
+              <w:left w:val="single" w:sz="4" w:color="D9D9D9"/>
+              <w:bottom w:val="single" w:sz="4" w:color="D9D9D9"/>
+              <w:right w:val="single" w:sz="4" w:color="D9D9D9"/>
+            </w:tcBorders>
+            <w:tcMar>
+              <w:top w:w="95" w:type="dxa"/>
+              <w:left w:w="95" w:type="dxa"/>
+              <w:bottom w:w="95" w:type="dxa"/>
+              <w:right w:w="95" w:type="dxa"/>
+            </w:tcMar>
+          </w:tcPr>
+          <w:p>
+            <w:pPr>
+              <w:spacing w:after="40" w:before="40" w:line="245" w:lineRule="auto"/>
+            </w:pPr>
+            <w:r>
+              <w:rPr>
+                <w:b w:val="0"/>
+                <w:color w:val="000000"/>
+                <w:sz w:val="20"/>
+              </w:rPr>
+              <w:t>0 / 6</w:t>
+            </w:r>
+          </w:p>
+        </w:tc>
+        <w:tc>
+          <w:tcPr>
+            <w:tcW w:type="dxa" w:w="2448"/>
+            <w:vAlign w:val="center"/>
+            <w:shd w:fill="FFFFFF"/>
+            <w:tcBorders>
+              <w:top w:val="single" w:sz="4" w:color="D9D9D9"/>
+              <w:left w:val="single" w:sz="4" w:color="D9D9D9"/>
+              <w:bottom w:val="single" w:sz="4" w:color="D9D9D9"/>
+              <w:right w:val="single" w:sz="4" w:color="D9D9D9"/>
+            </w:tcBorders>
+            <w:tcMar>
+              <w:top w:w="95" w:type="dxa"/>
+              <w:left w:w="95" w:type="dxa"/>
+              <w:bottom w:w="95" w:type="dxa"/>
+              <w:right w:w="95" w:type="dxa"/>
+            </w:tcMar>
+          </w:tcPr>
+          <w:p>
+            <w:pPr>
+              <w:spacing w:after="40" w:before="40" w:line="245" w:lineRule="auto"/>
+            </w:pPr>
+            <w:r>
+              <w:rPr>
+                <w:b w:val="0"/>
+                <w:color w:val="000000"/>
+                <w:sz w:val="20"/>
+              </w:rPr>
+              <w:t>0</w:t>
+            </w:r>
+          </w:p>
+        </w:tc>
+      </w:tr>
+    </w:tbl>
+    <w:p>
+      <w:pPr>
+        <w:spacing w:after="20"/>
+      </w:pPr>
+    </w:p>
+    <w:tbl>
+      <w:tblPr>
+        <w:tblW w:type="auto" w:w="0"/>
+        <w:tblLayout w:type="fixed"/>
+        <w:tblLook w:firstColumn="1" w:firstRow="1" w:lastColumn="0" w:lastRow="0" w:noHBand="0" w:noVBand="1" w:val="04A0"/>
+      </w:tblPr>
+      <w:tblGrid>
+        <w:gridCol w:w="3312"/>
+        <w:gridCol w:w="2160"/>
+        <w:gridCol w:w="2376"/>
+        <w:gridCol w:w="1944"/>
+      </w:tblGrid>
+      <w:tr>
+        <w:trPr>
+          <w:cantSplit/>
+          <w:tblHeader/>
+        </w:trPr>
+        <w:tc>
+          <w:tcPr>
+            <w:tcW w:type="dxa" w:w="3312"/>
+            <w:vAlign w:val="center"/>
+            <w:shd w:fill="263A52"/>
+            <w:tcBorders>
+              <w:top w:val="single" w:sz="4" w:color="D9D9D9"/>
+              <w:left w:val="single" w:sz="4" w:color="D9D9D9"/>
+              <w:bottom w:val="single" w:sz="4" w:color="D9D9D9"/>
+              <w:right w:val="single" w:sz="4" w:color="D9D9D9"/>
+            </w:tcBorders>
+            <w:tcMar>
+              <w:top w:w="95" w:type="dxa"/>
+              <w:left w:w="95" w:type="dxa"/>
+              <w:bottom w:w="95" w:type="dxa"/>
+              <w:right w:w="95" w:type="dxa"/>
+            </w:tcMar>
+          </w:tcPr>
+          <w:p>
+            <w:pPr>
+              <w:spacing w:after="40" w:before="40" w:line="245" w:lineRule="auto"/>
+            </w:pPr>
+            <w:r>
+              <w:rPr>
+                <w:b/>
+                <w:color w:val="FFFFFF"/>
+                <w:sz w:val="20"/>
+              </w:rPr>
+              <w:t>Value cohort</w:t>
+            </w:r>
+          </w:p>
+        </w:tc>
+        <w:tc>
+          <w:tcPr>
+            <w:tcW w:type="dxa" w:w="2160"/>
+            <w:vAlign w:val="center"/>
+            <w:shd w:fill="263A52"/>
+            <w:tcBorders>
+              <w:top w:val="single" w:sz="4" w:color="D9D9D9"/>
+              <w:left w:val="single" w:sz="4" w:color="D9D9D9"/>
+              <w:bottom w:val="single" w:sz="4" w:color="D9D9D9"/>
+              <w:right w:val="single" w:sz="4" w:color="D9D9D9"/>
+            </w:tcBorders>
+            <w:tcMar>
+              <w:top w:w="95" w:type="dxa"/>
+              <w:left w:w="95" w:type="dxa"/>
+              <w:bottom w:w="95" w:type="dxa"/>
+              <w:right w:w="95" w:type="dxa"/>
+            </w:tcMar>
+          </w:tcPr>
+          <w:p>
+            <w:pPr>
+              <w:spacing w:after="40" w:before="40" w:line="245" w:lineRule="auto"/>
+            </w:pPr>
+            <w:r>
+              <w:rPr>
+                <w:b/>
+                <w:color w:val="FFFFFF"/>
+                <w:sz w:val="20"/>
+              </w:rPr>
+              <w:t>Wrong raw / visible</w:t>
+            </w:r>
+          </w:p>
+        </w:tc>
+        <w:tc>
+          <w:tcPr>
+            <w:tcW w:type="dxa" w:w="2376"/>
+            <w:vAlign w:val="center"/>
+            <w:shd w:fill="263A52"/>
+            <w:tcBorders>
+              <w:top w:val="single" w:sz="4" w:color="D9D9D9"/>
+              <w:left w:val="single" w:sz="4" w:color="D9D9D9"/>
+              <w:bottom w:val="single" w:sz="4" w:color="D9D9D9"/>
+              <w:right w:val="single" w:sz="4" w:color="D9D9D9"/>
+            </w:tcBorders>
+            <w:tcMar>
+              <w:top w:w="95" w:type="dxa"/>
+              <w:left w:w="95" w:type="dxa"/>
+              <w:bottom w:w="95" w:type="dxa"/>
+              <w:right w:w="95" w:type="dxa"/>
+            </w:tcMar>
+          </w:tcPr>
+          <w:p>
+            <w:pPr>
+              <w:spacing w:after="40" w:before="40" w:line="245" w:lineRule="auto"/>
+            </w:pPr>
+            <w:r>
+              <w:rPr>
+                <w:b/>
+                <w:color w:val="FFFFFF"/>
+                <w:sz w:val="20"/>
+              </w:rPr>
+              <w:t>Refused raw / visible</w:t>
+            </w:r>
+          </w:p>
+        </w:tc>
+        <w:tc>
+          <w:tcPr>
+            <w:tcW w:type="dxa" w:w="1944"/>
+            <w:vAlign w:val="center"/>
+            <w:shd w:fill="263A52"/>
+            <w:tcBorders>
+              <w:top w:val="single" w:sz="4" w:color="D9D9D9"/>
+              <w:left w:val="single" w:sz="4" w:color="D9D9D9"/>
+              <w:bottom w:val="single" w:sz="4" w:color="D9D9D9"/>
+              <w:right w:val="single" w:sz="4" w:color="D9D9D9"/>
+            </w:tcBorders>
+            <w:tcMar>
+              <w:top w:w="95" w:type="dxa"/>
+              <w:left w:w="95" w:type="dxa"/>
+              <w:bottom w:w="95" w:type="dxa"/>
+              <w:right w:w="95" w:type="dxa"/>
+            </w:tcMar>
+          </w:tcPr>
+          <w:p>
+            <w:pPr>
+              <w:spacing w:after="40" w:before="40" w:line="245" w:lineRule="auto"/>
+            </w:pPr>
+            <w:r>
+              <w:rPr>
+                <w:b/>
+                <w:color w:val="FFFFFF"/>
+                <w:sz w:val="20"/>
+              </w:rPr>
+              <w:t>Answerable cells</w:t>
+            </w:r>
+          </w:p>
+        </w:tc>
+      </w:tr>
+      <w:tr>
+        <w:trPr>
+          <w:cantSplit/>
+        </w:trPr>
+        <w:tc>
+          <w:tcPr>
+            <w:tcW w:type="dxa" w:w="3312"/>
+            <w:vAlign w:val="center"/>
+            <w:shd w:fill="FFFFFF"/>
+            <w:tcBorders>
+              <w:top w:val="single" w:sz="4" w:color="D9D9D9"/>
+              <w:left w:val="single" w:sz="4" w:color="D9D9D9"/>
+              <w:bottom w:val="single" w:sz="4" w:color="D9D9D9"/>
+              <w:right w:val="single" w:sz="4" w:color="D9D9D9"/>
+            </w:tcBorders>
+            <w:tcMar>
+              <w:top w:w="95" w:type="dxa"/>
+              <w:left w:w="95" w:type="dxa"/>
+              <w:bottom w:w="95" w:type="dxa"/>
+              <w:right w:w="95" w:type="dxa"/>
+            </w:tcMar>
+          </w:tcPr>
+          <w:p>
+            <w:pPr>
+              <w:spacing w:after="40" w:before="40" w:line="245" w:lineRule="auto"/>
+            </w:pPr>
+            <w:r>
+              <w:rPr>
+                <w:b w:val="0"/>
+                <w:color w:val="000000"/>
+                <w:sz w:val="20"/>
+              </w:rPr>
+              <w:t>Semantic repairs</w:t>
+            </w:r>
+          </w:p>
+        </w:tc>
+        <w:tc>
+          <w:tcPr>
+            <w:tcW w:type="dxa" w:w="2160"/>
+            <w:vAlign w:val="center"/>
+            <w:shd w:fill="FFFFFF"/>
+            <w:tcBorders>
+              <w:top w:val="single" w:sz="4" w:color="D9D9D9"/>
+              <w:left w:val="single" w:sz="4" w:color="D9D9D9"/>
+              <w:bottom w:val="single" w:sz="4" w:color="D9D9D9"/>
+              <w:right w:val="single" w:sz="4" w:color="D9D9D9"/>
+            </w:tcBorders>
+            <w:tcMar>
+              <w:top w:w="95" w:type="dxa"/>
+              <w:left w:w="95" w:type="dxa"/>
+              <w:bottom w:w="95" w:type="dxa"/>
+              <w:right w:w="95" w:type="dxa"/>
+            </w:tcMar>
+          </w:tcPr>
+          <w:p>
+            <w:pPr>
+              <w:spacing w:after="40" w:before="40" w:line="245" w:lineRule="auto"/>
+            </w:pPr>
+            <w:r>
+              <w:rPr>
+                <w:b w:val="0"/>
+                <w:color w:val="000000"/>
+                <w:sz w:val="20"/>
+              </w:rPr>
+              <w:t>0 / 0</w:t>
+            </w:r>
+          </w:p>
+        </w:tc>
+        <w:tc>
+          <w:tcPr>
+            <w:tcW w:type="dxa" w:w="2376"/>
+            <w:vAlign w:val="center"/>
+            <w:shd w:fill="FFFFFF"/>
+            <w:tcBorders>
+              <w:top w:val="single" w:sz="4" w:color="D9D9D9"/>
+              <w:left w:val="single" w:sz="4" w:color="D9D9D9"/>
+              <w:bottom w:val="single" w:sz="4" w:color="D9D9D9"/>
+              <w:right w:val="single" w:sz="4" w:color="D9D9D9"/>
+            </w:tcBorders>
+            <w:tcMar>
+              <w:top w:w="95" w:type="dxa"/>
+              <w:left w:w="95" w:type="dxa"/>
+              <w:bottom w:w="95" w:type="dxa"/>
+              <w:right w:w="95" w:type="dxa"/>
+            </w:tcMar>
+          </w:tcPr>
+          <w:p>
+            <w:pPr>
+              <w:spacing w:after="40" w:before="40" w:line="245" w:lineRule="auto"/>
+            </w:pPr>
+            <w:r>
+              <w:rPr>
+                <w:b w:val="0"/>
+                <w:color w:val="000000"/>
+                <w:sz w:val="20"/>
+              </w:rPr>
+              <w:t>0 / 0</w:t>
+            </w:r>
+          </w:p>
+        </w:tc>
+        <w:tc>
+          <w:tcPr>
+            <w:tcW w:type="dxa" w:w="1944"/>
+            <w:vAlign w:val="center"/>
+            <w:shd w:fill="FFFFFF"/>
+            <w:tcBorders>
+              <w:top w:val="single" w:sz="4" w:color="D9D9D9"/>
+              <w:left w:val="single" w:sz="4" w:color="D9D9D9"/>
+              <w:bottom w:val="single" w:sz="4" w:color="D9D9D9"/>
+              <w:right w:val="single" w:sz="4" w:color="D9D9D9"/>
+            </w:tcBorders>
+            <w:tcMar>
+              <w:top w:w="95" w:type="dxa"/>
+              <w:left w:w="95" w:type="dxa"/>
+              <w:bottom w:w="95" w:type="dxa"/>
+              <w:right w:w="95" w:type="dxa"/>
+            </w:tcMar>
+          </w:tcPr>
+          <w:p>
+            <w:pPr>
+              <w:spacing w:after="40" w:before="40" w:line="245" w:lineRule="auto"/>
+            </w:pPr>
+            <w:r>
+              <w:rPr>
+                <w:b w:val="0"/>
+                <w:color w:val="000000"/>
+                <w:sz w:val="20"/>
+              </w:rPr>
+              <w:t>7</w:t>
+            </w:r>
+          </w:p>
+        </w:tc>
+      </w:tr>
+      <w:tr>
+        <w:trPr>
+          <w:cantSplit/>
+        </w:trPr>
+        <w:tc>
+          <w:tcPr>
+            <w:tcW w:type="dxa" w:w="3312"/>
+            <w:vAlign w:val="center"/>
+            <w:shd w:fill="F2F5F8"/>
+            <w:tcBorders>
+              <w:top w:val="single" w:sz="4" w:color="D9D9D9"/>
+              <w:left w:val="single" w:sz="4" w:color="D9D9D9"/>
+              <w:bottom w:val="single" w:sz="4" w:color="D9D9D9"/>
+              <w:right w:val="single" w:sz="4" w:color="D9D9D9"/>
+            </w:tcBorders>
+            <w:tcMar>
+              <w:top w:w="95" w:type="dxa"/>
+              <w:left w:w="95" w:type="dxa"/>
+              <w:bottom w:w="95" w:type="dxa"/>
+              <w:right w:w="95" w:type="dxa"/>
+            </w:tcMar>
+          </w:tcPr>
+          <w:p>
+            <w:pPr>
+              <w:spacing w:after="40" w:before="40" w:line="245" w:lineRule="auto"/>
+            </w:pPr>
+            <w:r>
+              <w:rPr>
+                <w:b w:val="0"/>
+                <w:color w:val="000000"/>
+                <w:sz w:val="20"/>
+              </w:rPr>
+              <w:t>Exceptions and knowledge</w:t>
+            </w:r>
+          </w:p>
+        </w:tc>
+        <w:tc>
+          <w:tcPr>
+            <w:tcW w:type="dxa" w:w="2160"/>
+            <w:vAlign w:val="center"/>
+            <w:shd w:fill="F2F5F8"/>
+            <w:tcBorders>
+              <w:top w:val="single" w:sz="4" w:color="D9D9D9"/>
+              <w:left w:val="single" w:sz="4" w:color="D9D9D9"/>
+              <w:bottom w:val="single" w:sz="4" w:color="D9D9D9"/>
+              <w:right w:val="single" w:sz="4" w:color="D9D9D9"/>
+            </w:tcBorders>
+            <w:tcMar>
+              <w:top w:w="95" w:type="dxa"/>
+              <w:left w:w="95" w:type="dxa"/>
+              <w:bottom w:w="95" w:type="dxa"/>
+              <w:right w:w="95" w:type="dxa"/>
+            </w:tcMar>
+          </w:tcPr>
+          <w:p>
+            <w:pPr>
+              <w:spacing w:after="40" w:before="40" w:line="245" w:lineRule="auto"/>
+            </w:pPr>
+            <w:r>
+              <w:rPr>
+                <w:b w:val="0"/>
+                <w:color w:val="000000"/>
+                <w:sz w:val="20"/>
+              </w:rPr>
+              <w:t>0 / 0</w:t>
+            </w:r>
+          </w:p>
+        </w:tc>
+        <w:tc>
+          <w:tcPr>
+            <w:tcW w:type="dxa" w:w="2376"/>
+            <w:vAlign w:val="center"/>
+            <w:shd w:fill="F2F5F8"/>
+            <w:tcBorders>
+              <w:top w:val="single" w:sz="4" w:color="D9D9D9"/>
+              <w:left w:val="single" w:sz="4" w:color="D9D9D9"/>
+              <w:bottom w:val="single" w:sz="4" w:color="D9D9D9"/>
+              <w:right w:val="single" w:sz="4" w:color="D9D9D9"/>
+            </w:tcBorders>
+            <w:tcMar>
+              <w:top w:w="95" w:type="dxa"/>
+              <w:left w:w="95" w:type="dxa"/>
+              <w:bottom w:w="95" w:type="dxa"/>
+              <w:right w:w="95" w:type="dxa"/>
+            </w:tcMar>
+          </w:tcPr>
+          <w:p>
+            <w:pPr>
+              <w:spacing w:after="40" w:before="40" w:line="245" w:lineRule="auto"/>
+            </w:pPr>
+            <w:r>
+              <w:rPr>
+                <w:b w:val="0"/>
+                <w:color w:val="000000"/>
+                <w:sz w:val="20"/>
+              </w:rPr>
+              <w:t>Not applicable</w:t>
+            </w:r>
+          </w:p>
+        </w:tc>
+        <w:tc>
+          <w:tcPr>
+            <w:tcW w:type="dxa" w:w="1944"/>
+            <w:vAlign w:val="center"/>
+            <w:shd w:fill="F2F5F8"/>
+            <w:tcBorders>
+              <w:top w:val="single" w:sz="4" w:color="D9D9D9"/>
+              <w:left w:val="single" w:sz="4" w:color="D9D9D9"/>
+              <w:bottom w:val="single" w:sz="4" w:color="D9D9D9"/>
+              <w:right w:val="single" w:sz="4" w:color="D9D9D9"/>
+            </w:tcBorders>
+            <w:tcMar>
+              <w:top w:w="95" w:type="dxa"/>
+              <w:left w:w="95" w:type="dxa"/>
+              <w:bottom w:w="95" w:type="dxa"/>
+              <w:right w:w="95" w:type="dxa"/>
+            </w:tcMar>
+          </w:tcPr>
+          <w:p>
+            <w:pPr>
+              <w:spacing w:after="40" w:before="40" w:line="245" w:lineRule="auto"/>
+            </w:pPr>
+            <w:r>
+              <w:rPr>
+                <w:b w:val="0"/>
+                <w:color w:val="000000"/>
+                <w:sz w:val="20"/>
+              </w:rPr>
+              <w:t>0</w:t>
+            </w:r>
+          </w:p>
+        </w:tc>
+      </w:tr>
+      <w:tr>
+        <w:trPr>
+          <w:cantSplit/>
+        </w:trPr>
+        <w:tc>
+          <w:tcPr>
+            <w:tcW w:type="dxa" w:w="3312"/>
+            <w:vAlign w:val="center"/>
+            <w:shd w:fill="FFFFFF"/>
+            <w:tcBorders>
+              <w:top w:val="single" w:sz="4" w:color="D9D9D9"/>
+              <w:left w:val="single" w:sz="4" w:color="D9D9D9"/>
+              <w:bottom w:val="single" w:sz="4" w:color="D9D9D9"/>
+              <w:right w:val="single" w:sz="4" w:color="D9D9D9"/>
+            </w:tcBorders>
+            <w:tcMar>
+              <w:top w:w="95" w:type="dxa"/>
+              <w:left w:w="95" w:type="dxa"/>
+              <w:bottom w:w="95" w:type="dxa"/>
+              <w:right w:w="95" w:type="dxa"/>
+            </w:tcMar>
+          </w:tcPr>
+          <w:p>
+            <w:pPr>
+              <w:spacing w:after="40" w:before="40" w:line="245" w:lineRule="auto"/>
+            </w:pPr>
+            <w:r>
+              <w:rPr>
+                <w:b w:val="0"/>
+                <w:color w:val="000000"/>
+                <w:sz w:val="20"/>
+              </w:rPr>
+              <w:t>Encoded source policies</w:t>
+            </w:r>
+          </w:p>
+        </w:tc>
+        <w:tc>
+          <w:tcPr>
+            <w:tcW w:type="dxa" w:w="2160"/>
+            <w:vAlign w:val="center"/>
+            <w:shd w:fill="FFFFFF"/>
+            <w:tcBorders>
+              <w:top w:val="single" w:sz="4" w:color="D9D9D9"/>
+              <w:left w:val="single" w:sz="4" w:color="D9D9D9"/>
+              <w:bottom w:val="single" w:sz="4" w:color="D9D9D9"/>
+              <w:right w:val="single" w:sz="4" w:color="D9D9D9"/>
+            </w:tcBorders>
+            <w:tcMar>
+              <w:top w:w="95" w:type="dxa"/>
+              <w:left w:w="95" w:type="dxa"/>
+              <w:bottom w:w="95" w:type="dxa"/>
+              <w:right w:w="95" w:type="dxa"/>
+            </w:tcMar>
+          </w:tcPr>
+          <w:p>
+            <w:pPr>
+              <w:spacing w:after="40" w:before="40" w:line="245" w:lineRule="auto"/>
+            </w:pPr>
+            <w:r>
+              <w:rPr>
+                <w:b w:val="0"/>
+                <w:color w:val="000000"/>
+                <w:sz w:val="20"/>
+              </w:rPr>
+              <w:t>0 / 0</w:t>
+            </w:r>
+          </w:p>
+        </w:tc>
+        <w:tc>
+          <w:tcPr>
+            <w:tcW w:type="dxa" w:w="2376"/>
+            <w:vAlign w:val="center"/>
+            <w:shd w:fill="FFFFFF"/>
+            <w:tcBorders>
+              <w:top w:val="single" w:sz="4" w:color="D9D9D9"/>
+              <w:left w:val="single" w:sz="4" w:color="D9D9D9"/>
+              <w:bottom w:val="single" w:sz="4" w:color="D9D9D9"/>
+              <w:right w:val="single" w:sz="4" w:color="D9D9D9"/>
+            </w:tcBorders>
+            <w:tcMar>
+              <w:top w:w="95" w:type="dxa"/>
+              <w:left w:w="95" w:type="dxa"/>
+              <w:bottom w:w="95" w:type="dxa"/>
+              <w:right w:w="95" w:type="dxa"/>
+            </w:tcMar>
+          </w:tcPr>
+          <w:p>
+            <w:pPr>
+              <w:spacing w:after="40" w:before="40" w:line="245" w:lineRule="auto"/>
+            </w:pPr>
+            <w:r>
+              <w:rPr>
+                <w:b w:val="0"/>
+                <w:color w:val="000000"/>
+                <w:sz w:val="20"/>
+              </w:rPr>
+              <w:t>Not applicable</w:t>
+            </w:r>
+          </w:p>
+        </w:tc>
+        <w:tc>
+          <w:tcPr>
+            <w:tcW w:type="dxa" w:w="1944"/>
+            <w:vAlign w:val="center"/>
+            <w:shd w:fill="FFFFFF"/>
+            <w:tcBorders>
+              <w:top w:val="single" w:sz="4" w:color="D9D9D9"/>
+              <w:left w:val="single" w:sz="4" w:color="D9D9D9"/>
+              <w:bottom w:val="single" w:sz="4" w:color="D9D9D9"/>
+              <w:right w:val="single" w:sz="4" w:color="D9D9D9"/>
+            </w:tcBorders>
+            <w:tcMar>
+              <w:top w:w="95" w:type="dxa"/>
+              <w:left w:w="95" w:type="dxa"/>
+              <w:bottom w:w="95" w:type="dxa"/>
+              <w:right w:w="95" w:type="dxa"/>
+            </w:tcMar>
+          </w:tcPr>
+          <w:p>
+            <w:pPr>
+              <w:spacing w:after="40" w:before="40" w:line="245" w:lineRule="auto"/>
+            </w:pPr>
+            <w:r>
+              <w:rPr>
+                <w:b w:val="0"/>
+                <w:color w:val="000000"/>
+                <w:sz w:val="20"/>
+              </w:rPr>
+              <w:t>0</w:t>
+            </w:r>
+          </w:p>
+        </w:tc>
+      </w:tr>
+      <w:tr>
+        <w:trPr>
+          <w:cantSplit/>
+        </w:trPr>
+        <w:tc>
+          <w:tcPr>
+            <w:tcW w:type="dxa" w:w="3312"/>
+            <w:vAlign w:val="center"/>
+            <w:shd w:fill="F2F5F8"/>
+            <w:tcBorders>
+              <w:top w:val="single" w:sz="4" w:color="D9D9D9"/>
+              <w:left w:val="single" w:sz="4" w:color="D9D9D9"/>
+              <w:bottom w:val="single" w:sz="4" w:color="D9D9D9"/>
+              <w:right w:val="single" w:sz="4" w:color="D9D9D9"/>
+            </w:tcBorders>
+            <w:tcMar>
+              <w:top w:w="95" w:type="dxa"/>
+              <w:left w:w="95" w:type="dxa"/>
+              <w:bottom w:w="95" w:type="dxa"/>
+              <w:right w:w="95" w:type="dxa"/>
+            </w:tcMar>
+          </w:tcPr>
+          <w:p>
+            <w:pPr>
+              <w:spacing w:after="40" w:before="40" w:line="245" w:lineRule="auto"/>
+            </w:pPr>
+            <w:r>
+              <w:rPr>
+                <w:b w:val="0"/>
+                <w:color w:val="000000"/>
+                <w:sz w:val="20"/>
+              </w:rPr>
+              <w:t>New holdout cases</w:t>
+            </w:r>
+          </w:p>
+        </w:tc>
+        <w:tc>
+          <w:tcPr>
+            <w:tcW w:type="dxa" w:w="2160"/>
+            <w:vAlign w:val="center"/>
+            <w:shd w:fill="F2F5F8"/>
+            <w:tcBorders>
+              <w:top w:val="single" w:sz="4" w:color="D9D9D9"/>
+              <w:left w:val="single" w:sz="4" w:color="D9D9D9"/>
+              <w:bottom w:val="single" w:sz="4" w:color="D9D9D9"/>
+              <w:right w:val="single" w:sz="4" w:color="D9D9D9"/>
+            </w:tcBorders>
+            <w:tcMar>
+              <w:top w:w="95" w:type="dxa"/>
+              <w:left w:w="95" w:type="dxa"/>
+              <w:bottom w:w="95" w:type="dxa"/>
+              <w:right w:w="95" w:type="dxa"/>
+            </w:tcMar>
+          </w:tcPr>
+          <w:p>
+            <w:pPr>
+              <w:spacing w:after="40" w:before="40" w:line="245" w:lineRule="auto"/>
+            </w:pPr>
+            <w:r>
+              <w:rPr>
+                <w:b w:val="0"/>
+                <w:color w:val="000000"/>
+                <w:sz w:val="20"/>
+              </w:rPr>
+              <w:t>0 / 0</w:t>
+            </w:r>
+          </w:p>
+        </w:tc>
+        <w:tc>
+          <w:tcPr>
+            <w:tcW w:type="dxa" w:w="2376"/>
+            <w:vAlign w:val="center"/>
+            <w:shd w:fill="F2F5F8"/>
+            <w:tcBorders>
+              <w:top w:val="single" w:sz="4" w:color="D9D9D9"/>
+              <w:left w:val="single" w:sz="4" w:color="D9D9D9"/>
+              <w:bottom w:val="single" w:sz="4" w:color="D9D9D9"/>
+              <w:right w:val="single" w:sz="4" w:color="D9D9D9"/>
+            </w:tcBorders>
+            <w:tcMar>
+              <w:top w:w="95" w:type="dxa"/>
+              <w:left w:w="95" w:type="dxa"/>
+              <w:bottom w:w="95" w:type="dxa"/>
+              <w:right w:w="95" w:type="dxa"/>
+            </w:tcMar>
+          </w:tcPr>
+          <w:p>
+            <w:pPr>
+              <w:spacing w:after="40" w:before="40" w:line="245" w:lineRule="auto"/>
+            </w:pPr>
+            <w:r>
+              <w:rPr>
+                <w:b w:val="0"/>
+                <w:color w:val="000000"/>
+                <w:sz w:val="20"/>
+              </w:rPr>
+              <w:t>Not applicable</w:t>
+            </w:r>
+          </w:p>
+        </w:tc>
+        <w:tc>
+          <w:tcPr>
+            <w:tcW w:type="dxa" w:w="1944"/>
+            <w:vAlign w:val="center"/>
+            <w:shd w:fill="F2F5F8"/>
+            <w:tcBorders>
+              <w:top w:val="single" w:sz="4" w:color="D9D9D9"/>
+              <w:left w:val="single" w:sz="4" w:color="D9D9D9"/>
+              <w:bottom w:val="single" w:sz="4" w:color="D9D9D9"/>
+              <w:right w:val="single" w:sz="4" w:color="D9D9D9"/>
+            </w:tcBorders>
+            <w:tcMar>
+              <w:top w:w="95" w:type="dxa"/>
+              <w:left w:w="95" w:type="dxa"/>
+              <w:bottom w:w="95" w:type="dxa"/>
+              <w:right w:w="95" w:type="dxa"/>
+            </w:tcMar>
+          </w:tcPr>
+          <w:p>
+            <w:pPr>
+              <w:spacing w:after="40" w:before="40" w:line="245" w:lineRule="auto"/>
+            </w:pPr>
+            <w:r>
+              <w:rPr>
+                <w:b w:val="0"/>
+                <w:color w:val="000000"/>
+                <w:sz w:val="20"/>
+              </w:rPr>
+              <w:t>0</w:t>
+            </w:r>
+          </w:p>
+        </w:tc>
+      </w:tr>
+    </w:tbl>
+    <w:p>
+      <w:pPr>
+        <w:spacing w:after="20"/>
+      </w:pPr>
+    </w:p>
+    <w:p>
+      <w:r>
+        <w:t>Wrong counts include unsupported guesses, even a lucky guess. Refusals count only explicit abstentions on answerable value requests; necessary requests for missing facts are not errors. Date conversion candidates selected during investigation are measured separately from value suggestions.</w:t>
+      </w:r>
+    </w:p>
+    <w:p>
+      <w:r>
+        <w:t>The run passed 18 of 18 reviewed outcomes, including 13 exact exports after scripted oracle corrections and two approvals. Raw response coverage was 21/21 requested cells. Investigation failures: 0; value fallback cases: 0. Completion includes known reviewer facts and is not autonomous correction accuracy.</w:t>
+      </w:r>
+    </w:p>
+    <w:p>
+      <w:r>
+        <w:t>Recorded usage: 105 requests and 109299 tokens. Raw responses, consented fictional payloads, tool calls and hashes are in docs/evaluations/nebius-fixed-v2.json. Corpus and protocol are in evaluations/nebius_fixed_v2/. Prior offline and Week 2 results are not pooled into these figures.</w:t>
+      </w:r>
+    </w:p>
+    <w:p>
+      <w:r>
+        <w:t>A separate final-code date check at 176ee0b passed 3/3 cases using 27 requests and 27490 tokens. It checks two impossible dates and a valid day-first conversion after binding conversion evidence to the current saved value. Its artifact is nebius-date-followup-v2.json; these repeated cases are not added to the 18-case totals.</w:t>
+      </w:r>
+    </w:p>
+    <w:p>
+      <w:r>
+        <w:t>Reproduce: python scripts/evaluate_nebius.py --suite fixed-v2 --live --consent-synthetic. Omit the two live flags for a local preflight. Each run has a unique output folder and a 120-request ceiling. These small synthetic samples cannot establish production accuracy or stable refusal rates; repeat with independently labeled source policies before broader claims.</w:t>
       </w:r>
     </w:p>
     <w:p>

</xml_diff>